<commit_message>
comments from Sara Berens and post presentation
</commit_message>
<xml_diff>
--- a/iturra-sanhueza_factorial-cohesion.docx
+++ b/iturra-sanhueza_factorial-cohesion.docx
@@ -1,13 +1,13 @@
 
 <file path=word/document.xml><?xml version="1.0" encoding="utf-8"?>
-<w:document xmlns:wpc="http://schemas.microsoft.com/office/word/2010/wordprocessingCanvas" xmlns:cx="http://schemas.microsoft.com/office/drawing/2014/chartex" xmlns:cx1="http://schemas.microsoft.com/office/drawing/2015/9/8/chartex" xmlns:cx2="http://schemas.microsoft.com/office/drawing/2015/10/21/chartex" xmlns:cx3="http://schemas.microsoft.com/office/drawing/2016/5/9/chartex" xmlns:cx4="http://schemas.microsoft.com/office/drawing/2016/5/10/chartex" xmlns:cx5="http://schemas.microsoft.com/office/drawing/2016/5/11/chartex" xmlns:cx6="http://schemas.microsoft.com/office/drawing/2016/5/12/chartex" xmlns:cx7="http://schemas.microsoft.com/office/drawing/2016/5/13/chartex" xmlns:cx8="http://schemas.microsoft.com/office/drawing/2016/5/14/chartex" xmlns:mc="http://schemas.openxmlformats.org/markup-compatibility/2006" xmlns:aink="http://schemas.microsoft.com/office/drawing/2016/ink" xmlns:am3d="http://schemas.microsoft.com/office/drawing/2017/model3d" xmlns:o="urn:schemas-microsoft-com:office:office" xmlns:oel="http://schemas.microsoft.com/office/2019/extlst" xmlns:r="http://schemas.openxmlformats.org/officeDocument/2006/relationships" xmlns:m="http://schemas.openxmlformats.org/officeDocument/2006/math" xmlns:v="urn:schemas-microsoft-com:vml" xmlns:wp14="http://schemas.microsoft.com/office/word/2010/wordprocessingDrawing" xmlns:wp="http://schemas.openxmlformats.org/drawingml/2006/wordprocessingDrawing" xmlns:w10="urn:schemas-microsoft-com:office:word" xmlns:w="http://schemas.openxmlformats.org/wordprocessingml/2006/main" xmlns:w14="http://schemas.microsoft.com/office/word/2010/wordml" xmlns:w15="http://schemas.microsoft.com/office/word/2012/wordml" xmlns:w16cex="http://schemas.microsoft.com/office/word/2018/wordml/cex" xmlns:w16cid="http://schemas.microsoft.com/office/word/2016/wordml/cid" xmlns:w16="http://schemas.microsoft.com/office/word/2018/wordml" xmlns:w16du="http://schemas.microsoft.com/office/word/2023/wordml/word16du" xmlns:w16sdtdh="http://schemas.microsoft.com/office/word/2020/wordml/sdtdatahash" xmlns:w16sdtfl="http://schemas.microsoft.com/office/word/2024/wordml/sdtformatlock" xmlns:w16se="http://schemas.microsoft.com/office/word/2015/wordml/symex" xmlns:wpg="http://schemas.microsoft.com/office/word/2010/wordprocessingGroup" xmlns:wpi="http://schemas.microsoft.com/office/word/2010/wordprocessingInk" xmlns:wne="http://schemas.microsoft.com/office/word/2006/wordml" xmlns:wps="http://schemas.microsoft.com/office/word/2010/wordprocessingShape" mc:Ignorable="w14 w15 w16se w16cid w16 w16cex w16sdtdh w16sdtfl w16du wp14">
+<w:document xmlns:wpc="http://schemas.microsoft.com/office/word/2010/wordprocessingCanvas" xmlns:cx="http://schemas.microsoft.com/office/drawing/2014/chartex" xmlns:cx1="http://schemas.microsoft.com/office/drawing/2015/9/8/chartex" xmlns:cx2="http://schemas.microsoft.com/office/drawing/2015/10/21/chartex" xmlns:cx3="http://schemas.microsoft.com/office/drawing/2016/5/9/chartex" xmlns:cx4="http://schemas.microsoft.com/office/drawing/2016/5/10/chartex" xmlns:cx5="http://schemas.microsoft.com/office/drawing/2016/5/11/chartex" xmlns:cx6="http://schemas.microsoft.com/office/drawing/2016/5/12/chartex" xmlns:cx7="http://schemas.microsoft.com/office/drawing/2016/5/13/chartex" xmlns:cx8="http://schemas.microsoft.com/office/drawing/2016/5/14/chartex" xmlns:mc="http://schemas.openxmlformats.org/markup-compatibility/2006" xmlns:aink="http://schemas.microsoft.com/office/drawing/2016/ink" xmlns:am3d="http://schemas.microsoft.com/office/drawing/2017/model3d" xmlns:o="urn:schemas-microsoft-com:office:office" xmlns:oel="http://schemas.microsoft.com/office/2019/extlst" xmlns:r="http://schemas.openxmlformats.org/officeDocument/2006/relationships" xmlns:m="http://schemas.openxmlformats.org/officeDocument/2006/math" xmlns:v="urn:schemas-microsoft-com:vml" xmlns:wp14="http://schemas.microsoft.com/office/word/2010/wordprocessingDrawing" xmlns:wp="http://schemas.openxmlformats.org/drawingml/2006/wordprocessingDrawing" xmlns:w10="urn:schemas-microsoft-com:office:word" xmlns:w="http://schemas.openxmlformats.org/wordprocessingml/2006/main" xmlns:w14="http://schemas.microsoft.com/office/word/2010/wordml" xmlns:w15="http://schemas.microsoft.com/office/word/2012/wordml" xmlns:w16cex="http://schemas.microsoft.com/office/word/2018/wordml/cex" xmlns:w16cid="http://schemas.microsoft.com/office/word/2016/wordml/cid" xmlns:w16="http://schemas.microsoft.com/office/word/2018/wordml" xmlns:w16du="http://schemas.microsoft.com/office/word/2023/wordml/word16du" xmlns:w16sdtdh="http://schemas.microsoft.com/office/word/2020/wordml/sdtdatahash" xmlns:w16sdtfl="http://schemas.microsoft.com/office/word/2024/wordml/sdtformatlock" xmlns:w16se="http://schemas.microsoft.com/office/word/2015/wordml/symex" xmlns:wpg="http://schemas.microsoft.com/office/word/2010/wordprocessingGroup" xmlns:wpi="http://schemas.microsoft.com/office/word/2010/wordprocessingInk" xmlns:wne="http://schemas.microsoft.com/office/word/2006/wordml" xmlns:wps="http://schemas.microsoft.com/office/word/2010/wordprocessingShape" xmlns:a="http://schemas.openxmlformats.org/drawingml/2006/main" xmlns:pic="http://schemas.openxmlformats.org/drawingml/2006/picture" xmlns:a14="http://schemas.microsoft.com/office/drawing/2010/main" mc:Ignorable="w14 w15 w16se w16cid w16 w16cex w16sdtdh w16sdtfl w16du wp14">
   <w:body>
     <w:p>
       <w:pPr>
         <w:pStyle w:val="TOCHeading"/>
         <w:ind w:left="0" w:firstLine="0"/>
         <w:rPr>
-          <w:rFonts w:asciiTheme="minorHAnsi" w:eastAsiaTheme="minorHAnsi" w:hAnsiTheme="minorHAnsi" w:cstheme="minorBidi"/>
+          <w:rFonts w:asciiTheme="minorHAnsi" w:hAnsiTheme="minorHAnsi" w:eastAsiaTheme="minorHAnsi" w:cstheme="minorBidi"/>
           <w:color w:val="auto"/>
           <w:kern w:val="2"/>
           <w:sz w:val="24"/>
@@ -69,7 +69,7 @@
           <w:lang w:val="en-US"/>
         </w:rPr>
       </w:pPr>
-      <w:bookmarkStart w:id="0" w:name="_Toc230097870"/>
+      <w:bookmarkStart w:name="_Toc230097870" w:id="0"/>
       <w:r>
         <w:rPr>
           <w:lang w:val="en-US"/>
@@ -503,7 +503,6 @@
         <w:rPr>
           <w:lang w:val="en-US"/>
         </w:rPr>
-        <w:lastRenderedPageBreak/>
         <w:t xml:space="preserve">scholarship on </w:t>
       </w:r>
       <w:r>
@@ -987,7 +986,7 @@
           <w:lang w:val="en-US"/>
         </w:rPr>
       </w:pPr>
-      <w:bookmarkStart w:id="1" w:name="_Toc230097871"/>
+      <w:bookmarkStart w:name="_Toc230097871" w:id="1"/>
       <w:r>
         <w:rPr>
           <w:highlight w:val="yellow"/>
@@ -1054,7 +1053,7 @@
           <w:lang w:val="en-US"/>
         </w:rPr>
       </w:pPr>
-      <w:bookmarkStart w:id="2" w:name="_Toc230097872"/>
+      <w:bookmarkStart w:name="_Toc230097872" w:id="2"/>
       <w:r>
         <w:rPr>
           <w:lang w:val="en-US"/>
@@ -1385,7 +1384,6 @@
           <w:rFonts w:cs="Times New Roman"/>
           <w:lang w:val="en-US"/>
         </w:rPr>
-        <w:lastRenderedPageBreak/>
         <w:t>debate, contemporary works</w:t>
       </w:r>
       <w:r>
@@ -2133,7 +2131,6 @@
           <w:rFonts w:cs="Times New Roman"/>
           <w:lang w:val="en-US"/>
         </w:rPr>
-        <w:lastRenderedPageBreak/>
         <w:t xml:space="preserve">all the ingredients in an additive “more integrated” society. Rather, these describe the parts of a social mechanism </w:t>
       </w:r>
       <w:r>
@@ -2412,7 +2409,7 @@
           <w:lang w:val="en-US"/>
         </w:rPr>
       </w:pPr>
-      <w:bookmarkStart w:id="3" w:name="_Toc230097873"/>
+      <w:bookmarkStart w:name="_Toc230097873" w:id="3"/>
       <w:r>
         <w:rPr>
           <w:lang w:val="en-US"/>
@@ -2777,7 +2774,6 @@
           <w:rFonts w:cs="Times New Roman"/>
           <w:lang w:val="en-US"/>
         </w:rPr>
-        <w:lastRenderedPageBreak/>
         <w:t>2015; Koopmans &amp; Schaeffer, 2016)</w:t>
       </w:r>
       <w:r>
@@ -3067,7 +3063,7 @@
           <w:lang w:val="en-US"/>
         </w:rPr>
       </w:pPr>
-      <w:bookmarkStart w:id="4" w:name="_Toc230097874"/>
+      <w:bookmarkStart w:name="_Toc230097874" w:id="4"/>
       <w:r>
         <w:rPr>
           <w:lang w:val="en-US"/>
@@ -3227,7 +3223,7 @@
           <w:lang w:val="en-US"/>
         </w:rPr>
       </w:pPr>
-      <w:bookmarkStart w:id="5" w:name="_Toc230097875"/>
+      <w:bookmarkStart w:name="_Toc230097875" w:id="5"/>
       <w:r>
         <w:rPr>
           <w:lang w:val="en-US"/>
@@ -3373,7 +3369,6 @@
           <w:rFonts w:cs="Times New Roman"/>
           <w:lang w:val="en-US"/>
         </w:rPr>
-        <w:lastRenderedPageBreak/>
         <w:t xml:space="preserve">(the degree of status disparity along graduated dimensions). Derived from these two macrosocial characteristics, it is argued that </w:t>
       </w:r>
       <w:r>
@@ -4225,7 +4220,6 @@
         <w:rPr>
           <w:lang w:val="en-US"/>
         </w:rPr>
-        <w:lastRenderedPageBreak/>
         <w:t xml:space="preserve">an intermediate position because it shares elements with both openness to change and self-enhancement. </w:t>
       </w:r>
     </w:p>
@@ -4566,7 +4560,7 @@
           <w:lang w:val="en-US"/>
         </w:rPr>
       </w:pPr>
-      <w:bookmarkStart w:id="7" w:name="_Toc230097876"/>
+      <w:bookmarkStart w:name="_Toc230097876" w:id="7"/>
       <w:r>
         <w:rPr>
           <w:lang w:val="en-US"/>
@@ -4677,7 +4671,6 @@
         <w:t xml:space="preserve">. Education is particularly relevant from this perspective, as credentials function not only as markers of resources but also as cultural signals of refinement and distinction. Educational attainment therefore shapes judgments of both competence </w:t>
       </w:r>
       <w:r>
-        <w:lastRenderedPageBreak/>
         <w:t xml:space="preserve">and social fit — making it consequential for expectations of cohesion beyond what income alone would predict — primarily when it signals shared cultural standing rather than mere economic rank  </w:t>
       </w:r>
       <w:r>
@@ -4843,7 +4836,7 @@
           <w:lang w:val="en-US"/>
         </w:rPr>
       </w:pPr>
-      <w:bookmarkStart w:id="8" w:name="_Toc230097877"/>
+      <w:bookmarkStart w:name="_Toc230097877" w:id="8"/>
       <w:r>
         <w:rPr>
           <w:lang w:val="en-US"/>
@@ -5027,7 +5020,6 @@
           <w:kern w:val="0"/>
           <w:lang w:val="en-US"/>
         </w:rPr>
-        <w:lastRenderedPageBreak/>
         <w:t>Helbling et al., 2022; Helbling &amp; Traunmüller, 2020)</w:t>
       </w:r>
       <w:r>
@@ -5643,7 +5635,7 @@
           <w:lang w:val="en-US"/>
         </w:rPr>
       </w:pPr>
-      <w:bookmarkStart w:id="9" w:name="_Toc230097878"/>
+      <w:bookmarkStart w:name="_Toc230097878" w:id="9"/>
       <w:r>
         <w:rPr>
           <w:lang w:val="en-US"/>
@@ -5660,7 +5652,6 @@
         <w:t xml:space="preserve">I conceive values and political ideology are both subjective social positions— orientations that individuals carry and that shape how they evaluate others — but they operate differently as social </w:t>
       </w:r>
       <w:r>
-        <w:lastRenderedPageBreak/>
         <w:t>cues. Values are abstract, trans-situational principles that orient action across contexts and are not always publicly visible. Ideology is more concrete, publicly identifiable, and tied to collective political life. Both matter for horizontal social cohesion because they shape expectations about whether others are likely to act fairly, cooperate, or reciprocate — and because observers use them as signals to infer the likely conduct of unknown others. Unlike objective positions such as income or migration background, values and ideology are not directly observable, observers must infer them from behavioral cues, stated positions, or labels..</w:t>
       </w:r>
     </w:p>
@@ -5883,7 +5874,6 @@
         <w:pStyle w:val="font-claude-response-body"/>
       </w:pPr>
       <w:r>
-        <w:lastRenderedPageBreak/>
         <w:t xml:space="preserve">Ideological positions are more concrete, publicly identifiable, and organized around collective political life than values, and for this reason they function as especially legible social cues in interpersonal evaluation </w:t>
       </w:r>
       <w:r>
@@ -6145,7 +6135,6 @@
         <w:t xml:space="preserve"> </w:t>
       </w:r>
       <w:r>
-        <w:lastRenderedPageBreak/>
         <w:t>. Where stigmatization is concentrated at one pole, as in parts of Western Europe shaped by the memory of right-wing atrocity, the social cost is asymmetrically distributed rather than shared across both extremes (Blinder et al., 2013; Matsunaga &amp; Spanje, 2025). The broader implication is that the distribution of positive interactional expectations across the ideological spectrum depends on whether its poles are historically burdened — a product of political conflict rather than of the identity and distance mechanisms alone.</w:t>
       </w:r>
     </w:p>
@@ -6205,7 +6194,7 @@
           <w:lang w:val="en-US"/>
         </w:rPr>
       </w:pPr>
-      <w:bookmarkStart w:id="10" w:name="_Toc230097879"/>
+      <w:bookmarkStart w:name="_Toc230097879" w:id="10"/>
       <w:r>
         <w:rPr>
           <w:lang w:val="en-US"/>
@@ -6243,6 +6232,11 @@
           <w:lang w:val="en-US"/>
         </w:rPr>
         <w:br/>
+      </w:r>
+      <w:r>
+        <w:rPr>
+          <w:lang w:val="en-US"/>
+        </w:rPr>
         <w:t>In the study of social similarity, h</w:t>
       </w:r>
       <w:r>
@@ -6622,7 +6616,6 @@
         <w:rPr>
           <w:lang w:val="en-US"/>
         </w:rPr>
-        <w:lastRenderedPageBreak/>
         <w:t>similarity are not uniform dispositions. They are socially situated judgments whose force depends on the dimension of similarity at stake and on the actor’s own location in the social structure.</w:t>
       </w:r>
     </w:p>
@@ -6831,7 +6824,7 @@
           <w:lang w:val="en-US"/>
         </w:rPr>
       </w:pPr>
-      <w:bookmarkStart w:id="11" w:name="_Toc230097880"/>
+      <w:bookmarkStart w:name="_Toc230097880" w:id="11"/>
       <w:r>
         <w:rPr>
           <w:lang w:val="en-US"/>
@@ -7584,7 +7577,6 @@
         <w:rPr>
           <w:lang w:val="en-US"/>
         </w:rPr>
-        <w:lastRenderedPageBreak/>
         <w:t>3.2 Experimental Design</w:t>
       </w:r>
     </w:p>
@@ -7864,7 +7856,7 @@
             <w:tcBorders>
               <w:top w:val="nil"/>
               <w:left w:val="nil"/>
-              <w:bottom w:val="single" w:sz="12" w:space="0" w:color="000000"/>
+              <w:bottom w:val="single" w:color="000000" w:sz="12" w:space="0"/>
               <w:right w:val="nil"/>
             </w:tcBorders>
             <w:noWrap/>
@@ -7900,7 +7892,7 @@
             <w:tcBorders>
               <w:top w:val="nil"/>
               <w:left w:val="nil"/>
-              <w:bottom w:val="single" w:sz="8" w:space="0" w:color="000000"/>
+              <w:bottom w:val="single" w:color="000000" w:sz="8" w:space="0"/>
               <w:right w:val="nil"/>
             </w:tcBorders>
             <w:vAlign w:val="center"/>
@@ -7925,7 +7917,6 @@
                 <w:sz w:val="20"/>
                 <w:szCs w:val="20"/>
               </w:rPr>
-              <w:lastRenderedPageBreak/>
               <w:t>Dimension</w:t>
             </w:r>
           </w:p>
@@ -7936,7 +7927,7 @@
             <w:tcBorders>
               <w:top w:val="nil"/>
               <w:left w:val="nil"/>
-              <w:bottom w:val="single" w:sz="8" w:space="0" w:color="000000"/>
+              <w:bottom w:val="single" w:color="000000" w:sz="8" w:space="0"/>
               <w:right w:val="nil"/>
             </w:tcBorders>
             <w:vAlign w:val="center"/>
@@ -7971,7 +7962,7 @@
             <w:tcBorders>
               <w:top w:val="nil"/>
               <w:left w:val="nil"/>
-              <w:bottom w:val="single" w:sz="8" w:space="0" w:color="000000"/>
+              <w:bottom w:val="single" w:color="000000" w:sz="8" w:space="0"/>
               <w:right w:val="nil"/>
             </w:tcBorders>
             <w:vAlign w:val="center"/>
@@ -8012,7 +8003,7 @@
             <w:tcBorders>
               <w:top w:val="nil"/>
               <w:left w:val="nil"/>
-              <w:bottom w:val="single" w:sz="8" w:space="0" w:color="000000"/>
+              <w:bottom w:val="single" w:color="000000" w:sz="8" w:space="0"/>
               <w:right w:val="nil"/>
             </w:tcBorders>
             <w:hideMark/>
@@ -8046,7 +8037,7 @@
             <w:tcBorders>
               <w:top w:val="nil"/>
               <w:left w:val="nil"/>
-              <w:bottom w:val="single" w:sz="8" w:space="0" w:color="000000"/>
+              <w:bottom w:val="single" w:color="000000" w:sz="8" w:space="0"/>
               <w:right w:val="nil"/>
             </w:tcBorders>
             <w:vAlign w:val="center"/>
@@ -8077,7 +8068,7 @@
             <w:tcBorders>
               <w:top w:val="nil"/>
               <w:left w:val="nil"/>
-              <w:bottom w:val="single" w:sz="8" w:space="0" w:color="000000"/>
+              <w:bottom w:val="single" w:color="000000" w:sz="8" w:space="0"/>
               <w:right w:val="nil"/>
             </w:tcBorders>
             <w:vAlign w:val="center"/>
@@ -8114,7 +8105,7 @@
             <w:tcBorders>
               <w:top w:val="nil"/>
               <w:left w:val="nil"/>
-              <w:bottom w:val="single" w:sz="8" w:space="0" w:color="000000"/>
+              <w:bottom w:val="single" w:color="000000" w:sz="8" w:space="0"/>
               <w:right w:val="nil"/>
             </w:tcBorders>
             <w:vAlign w:val="center"/>
@@ -8139,7 +8130,7 @@
             <w:tcBorders>
               <w:top w:val="nil"/>
               <w:left w:val="nil"/>
-              <w:bottom w:val="single" w:sz="8" w:space="0" w:color="000000"/>
+              <w:bottom w:val="single" w:color="000000" w:sz="8" w:space="0"/>
               <w:right w:val="nil"/>
             </w:tcBorders>
             <w:vAlign w:val="center"/>
@@ -8170,7 +8161,7 @@
             <w:tcBorders>
               <w:top w:val="nil"/>
               <w:left w:val="nil"/>
-              <w:bottom w:val="single" w:sz="8" w:space="0" w:color="000000"/>
+              <w:bottom w:val="single" w:color="000000" w:sz="8" w:space="0"/>
               <w:right w:val="nil"/>
             </w:tcBorders>
             <w:vAlign w:val="center"/>
@@ -8207,7 +8198,7 @@
             <w:tcBorders>
               <w:top w:val="nil"/>
               <w:left w:val="nil"/>
-              <w:bottom w:val="single" w:sz="8" w:space="0" w:color="000000"/>
+              <w:bottom w:val="single" w:color="000000" w:sz="8" w:space="0"/>
               <w:right w:val="nil"/>
             </w:tcBorders>
             <w:vAlign w:val="center"/>
@@ -8232,7 +8223,7 @@
             <w:tcBorders>
               <w:top w:val="nil"/>
               <w:left w:val="nil"/>
-              <w:bottom w:val="single" w:sz="8" w:space="0" w:color="000000"/>
+              <w:bottom w:val="single" w:color="000000" w:sz="8" w:space="0"/>
               <w:right w:val="nil"/>
             </w:tcBorders>
             <w:vAlign w:val="center"/>
@@ -8263,7 +8254,7 @@
             <w:tcBorders>
               <w:top w:val="nil"/>
               <w:left w:val="nil"/>
-              <w:bottom w:val="single" w:sz="8" w:space="0" w:color="000000"/>
+              <w:bottom w:val="single" w:color="000000" w:sz="8" w:space="0"/>
               <w:right w:val="nil"/>
             </w:tcBorders>
             <w:vAlign w:val="center"/>
@@ -8300,7 +8291,7 @@
             <w:tcBorders>
               <w:top w:val="nil"/>
               <w:left w:val="nil"/>
-              <w:bottom w:val="single" w:sz="8" w:space="0" w:color="000000"/>
+              <w:bottom w:val="single" w:color="000000" w:sz="8" w:space="0"/>
               <w:right w:val="nil"/>
             </w:tcBorders>
             <w:hideMark/>
@@ -8334,7 +8325,7 @@
             <w:tcBorders>
               <w:top w:val="nil"/>
               <w:left w:val="nil"/>
-              <w:bottom w:val="single" w:sz="8" w:space="0" w:color="000000"/>
+              <w:bottom w:val="single" w:color="000000" w:sz="8" w:space="0"/>
               <w:right w:val="nil"/>
             </w:tcBorders>
             <w:vAlign w:val="center"/>
@@ -8365,7 +8356,7 @@
             <w:tcBorders>
               <w:top w:val="nil"/>
               <w:left w:val="nil"/>
-              <w:bottom w:val="single" w:sz="8" w:space="0" w:color="000000"/>
+              <w:bottom w:val="single" w:color="000000" w:sz="8" w:space="0"/>
               <w:right w:val="nil"/>
             </w:tcBorders>
             <w:vAlign w:val="center"/>
@@ -8410,7 +8401,7 @@
             <w:tcBorders>
               <w:top w:val="nil"/>
               <w:left w:val="nil"/>
-              <w:bottom w:val="single" w:sz="8" w:space="0" w:color="000000"/>
+              <w:bottom w:val="single" w:color="000000" w:sz="8" w:space="0"/>
               <w:right w:val="nil"/>
             </w:tcBorders>
             <w:vAlign w:val="center"/>
@@ -8435,7 +8426,7 @@
             <w:tcBorders>
               <w:top w:val="nil"/>
               <w:left w:val="nil"/>
-              <w:bottom w:val="single" w:sz="8" w:space="0" w:color="000000"/>
+              <w:bottom w:val="single" w:color="000000" w:sz="8" w:space="0"/>
               <w:right w:val="nil"/>
             </w:tcBorders>
             <w:vAlign w:val="center"/>
@@ -8466,7 +8457,7 @@
             <w:tcBorders>
               <w:top w:val="nil"/>
               <w:left w:val="nil"/>
-              <w:bottom w:val="single" w:sz="8" w:space="0" w:color="000000"/>
+              <w:bottom w:val="single" w:color="000000" w:sz="8" w:space="0"/>
               <w:right w:val="nil"/>
             </w:tcBorders>
             <w:vAlign w:val="center"/>
@@ -8511,7 +8502,7 @@
             <w:tcBorders>
               <w:top w:val="nil"/>
               <w:left w:val="nil"/>
-              <w:bottom w:val="single" w:sz="8" w:space="0" w:color="000000"/>
+              <w:bottom w:val="single" w:color="000000" w:sz="8" w:space="0"/>
               <w:right w:val="nil"/>
             </w:tcBorders>
             <w:vAlign w:val="center"/>
@@ -8536,7 +8527,7 @@
             <w:tcBorders>
               <w:top w:val="nil"/>
               <w:left w:val="nil"/>
-              <w:bottom w:val="single" w:sz="8" w:space="0" w:color="000000"/>
+              <w:bottom w:val="single" w:color="000000" w:sz="8" w:space="0"/>
               <w:right w:val="nil"/>
             </w:tcBorders>
             <w:vAlign w:val="center"/>
@@ -8567,7 +8558,7 @@
             <w:tcBorders>
               <w:top w:val="nil"/>
               <w:left w:val="nil"/>
-              <w:bottom w:val="single" w:sz="8" w:space="0" w:color="000000"/>
+              <w:bottom w:val="single" w:color="000000" w:sz="8" w:space="0"/>
               <w:right w:val="nil"/>
             </w:tcBorders>
             <w:vAlign w:val="center"/>
@@ -8604,7 +8595,7 @@
             <w:tcBorders>
               <w:top w:val="nil"/>
               <w:left w:val="nil"/>
-              <w:bottom w:val="single" w:sz="8" w:space="0" w:color="000000"/>
+              <w:bottom w:val="single" w:color="000000" w:sz="8" w:space="0"/>
               <w:right w:val="nil"/>
             </w:tcBorders>
             <w:hideMark/>
@@ -8638,7 +8629,7 @@
             <w:tcBorders>
               <w:top w:val="nil"/>
               <w:left w:val="nil"/>
-              <w:bottom w:val="single" w:sz="8" w:space="0" w:color="000000"/>
+              <w:bottom w:val="single" w:color="000000" w:sz="8" w:space="0"/>
               <w:right w:val="nil"/>
             </w:tcBorders>
             <w:vAlign w:val="center"/>
@@ -8669,7 +8660,7 @@
             <w:tcBorders>
               <w:top w:val="nil"/>
               <w:left w:val="nil"/>
-              <w:bottom w:val="single" w:sz="8" w:space="0" w:color="000000"/>
+              <w:bottom w:val="single" w:color="000000" w:sz="8" w:space="0"/>
               <w:right w:val="nil"/>
             </w:tcBorders>
             <w:vAlign w:val="center"/>
@@ -8708,7 +8699,7 @@
             <w:tcBorders>
               <w:top w:val="nil"/>
               <w:left w:val="nil"/>
-              <w:bottom w:val="single" w:sz="8" w:space="0" w:color="000000"/>
+              <w:bottom w:val="single" w:color="000000" w:sz="8" w:space="0"/>
               <w:right w:val="nil"/>
             </w:tcBorders>
             <w:vAlign w:val="center"/>
@@ -8734,7 +8725,7 @@
             <w:tcBorders>
               <w:top w:val="nil"/>
               <w:left w:val="nil"/>
-              <w:bottom w:val="single" w:sz="8" w:space="0" w:color="000000"/>
+              <w:bottom w:val="single" w:color="000000" w:sz="8" w:space="0"/>
               <w:right w:val="nil"/>
             </w:tcBorders>
             <w:vAlign w:val="center"/>
@@ -8765,7 +8756,7 @@
             <w:tcBorders>
               <w:top w:val="nil"/>
               <w:left w:val="nil"/>
-              <w:bottom w:val="single" w:sz="8" w:space="0" w:color="000000"/>
+              <w:bottom w:val="single" w:color="000000" w:sz="8" w:space="0"/>
               <w:right w:val="nil"/>
             </w:tcBorders>
             <w:vAlign w:val="center"/>
@@ -8804,7 +8795,7 @@
             <w:tcBorders>
               <w:top w:val="nil"/>
               <w:left w:val="nil"/>
-              <w:bottom w:val="single" w:sz="8" w:space="0" w:color="000000"/>
+              <w:bottom w:val="single" w:color="000000" w:sz="8" w:space="0"/>
               <w:right w:val="nil"/>
             </w:tcBorders>
             <w:vAlign w:val="center"/>
@@ -8830,7 +8821,7 @@
             <w:tcBorders>
               <w:top w:val="nil"/>
               <w:left w:val="nil"/>
-              <w:bottom w:val="single" w:sz="8" w:space="0" w:color="000000"/>
+              <w:bottom w:val="single" w:color="000000" w:sz="8" w:space="0"/>
               <w:right w:val="nil"/>
             </w:tcBorders>
             <w:vAlign w:val="center"/>
@@ -8861,7 +8852,7 @@
             <w:tcBorders>
               <w:top w:val="nil"/>
               <w:left w:val="nil"/>
-              <w:bottom w:val="single" w:sz="8" w:space="0" w:color="000000"/>
+              <w:bottom w:val="single" w:color="000000" w:sz="8" w:space="0"/>
               <w:right w:val="nil"/>
             </w:tcBorders>
             <w:vAlign w:val="center"/>
@@ -8900,7 +8891,7 @@
             <w:tcBorders>
               <w:top w:val="nil"/>
               <w:left w:val="nil"/>
-              <w:bottom w:val="single" w:sz="8" w:space="0" w:color="000000"/>
+              <w:bottom w:val="single" w:color="000000" w:sz="8" w:space="0"/>
               <w:right w:val="nil"/>
             </w:tcBorders>
             <w:hideMark/>
@@ -8944,7 +8935,7 @@
             <w:tcBorders>
               <w:top w:val="nil"/>
               <w:left w:val="nil"/>
-              <w:bottom w:val="single" w:sz="8" w:space="0" w:color="000000"/>
+              <w:bottom w:val="single" w:color="000000" w:sz="8" w:space="0"/>
               <w:right w:val="nil"/>
             </w:tcBorders>
             <w:vAlign w:val="center"/>
@@ -8975,7 +8966,7 @@
             <w:tcBorders>
               <w:top w:val="nil"/>
               <w:left w:val="nil"/>
-              <w:bottom w:val="single" w:sz="8" w:space="0" w:color="000000"/>
+              <w:bottom w:val="single" w:color="000000" w:sz="8" w:space="0"/>
               <w:right w:val="nil"/>
             </w:tcBorders>
             <w:vAlign w:val="center"/>
@@ -9012,7 +9003,7 @@
             <w:tcBorders>
               <w:top w:val="nil"/>
               <w:left w:val="nil"/>
-              <w:bottom w:val="single" w:sz="8" w:space="0" w:color="000000"/>
+              <w:bottom w:val="single" w:color="000000" w:sz="8" w:space="0"/>
               <w:right w:val="nil"/>
             </w:tcBorders>
             <w:vAlign w:val="center"/>
@@ -9037,7 +9028,7 @@
             <w:tcBorders>
               <w:top w:val="nil"/>
               <w:left w:val="nil"/>
-              <w:bottom w:val="single" w:sz="8" w:space="0" w:color="000000"/>
+              <w:bottom w:val="single" w:color="000000" w:sz="8" w:space="0"/>
               <w:right w:val="nil"/>
             </w:tcBorders>
             <w:vAlign w:val="center"/>
@@ -9068,7 +9059,7 @@
             <w:tcBorders>
               <w:top w:val="nil"/>
               <w:left w:val="nil"/>
-              <w:bottom w:val="single" w:sz="8" w:space="0" w:color="000000"/>
+              <w:bottom w:val="single" w:color="000000" w:sz="8" w:space="0"/>
               <w:right w:val="nil"/>
             </w:tcBorders>
             <w:vAlign w:val="center"/>
@@ -9105,7 +9096,7 @@
             <w:tcBorders>
               <w:top w:val="nil"/>
               <w:left w:val="nil"/>
-              <w:bottom w:val="single" w:sz="8" w:space="0" w:color="000000"/>
+              <w:bottom w:val="single" w:color="000000" w:sz="8" w:space="0"/>
               <w:right w:val="nil"/>
             </w:tcBorders>
             <w:vAlign w:val="center"/>
@@ -9130,7 +9121,7 @@
             <w:tcBorders>
               <w:top w:val="nil"/>
               <w:left w:val="nil"/>
-              <w:bottom w:val="single" w:sz="8" w:space="0" w:color="000000"/>
+              <w:bottom w:val="single" w:color="000000" w:sz="8" w:space="0"/>
               <w:right w:val="nil"/>
             </w:tcBorders>
             <w:vAlign w:val="center"/>
@@ -9161,7 +9152,7 @@
             <w:tcBorders>
               <w:top w:val="nil"/>
               <w:left w:val="nil"/>
-              <w:bottom w:val="single" w:sz="8" w:space="0" w:color="000000"/>
+              <w:bottom w:val="single" w:color="000000" w:sz="8" w:space="0"/>
               <w:right w:val="nil"/>
             </w:tcBorders>
             <w:vAlign w:val="center"/>
@@ -9198,7 +9189,7 @@
             <w:tcBorders>
               <w:top w:val="nil"/>
               <w:left w:val="nil"/>
-              <w:bottom w:val="single" w:sz="8" w:space="0" w:color="000000"/>
+              <w:bottom w:val="single" w:color="000000" w:sz="8" w:space="0"/>
               <w:right w:val="nil"/>
             </w:tcBorders>
             <w:vAlign w:val="center"/>
@@ -9223,7 +9214,7 @@
             <w:tcBorders>
               <w:top w:val="nil"/>
               <w:left w:val="nil"/>
-              <w:bottom w:val="single" w:sz="8" w:space="0" w:color="000000"/>
+              <w:bottom w:val="single" w:color="000000" w:sz="8" w:space="0"/>
               <w:right w:val="nil"/>
             </w:tcBorders>
             <w:vAlign w:val="center"/>
@@ -9254,7 +9245,7 @@
             <w:tcBorders>
               <w:top w:val="nil"/>
               <w:left w:val="nil"/>
-              <w:bottom w:val="single" w:sz="8" w:space="0" w:color="000000"/>
+              <w:bottom w:val="single" w:color="000000" w:sz="8" w:space="0"/>
               <w:right w:val="nil"/>
             </w:tcBorders>
             <w:vAlign w:val="center"/>
@@ -9291,7 +9282,7 @@
             <w:tcBorders>
               <w:top w:val="nil"/>
               <w:left w:val="nil"/>
-              <w:bottom w:val="single" w:sz="8" w:space="0" w:color="000000"/>
+              <w:bottom w:val="single" w:color="000000" w:sz="8" w:space="0"/>
               <w:right w:val="nil"/>
             </w:tcBorders>
             <w:hideMark/>
@@ -9325,7 +9316,7 @@
             <w:tcBorders>
               <w:top w:val="nil"/>
               <w:left w:val="nil"/>
-              <w:bottom w:val="single" w:sz="8" w:space="0" w:color="000000"/>
+              <w:bottom w:val="single" w:color="000000" w:sz="8" w:space="0"/>
               <w:right w:val="nil"/>
             </w:tcBorders>
             <w:vAlign w:val="center"/>
@@ -9356,7 +9347,7 @@
             <w:tcBorders>
               <w:top w:val="nil"/>
               <w:left w:val="nil"/>
-              <w:bottom w:val="single" w:sz="8" w:space="0" w:color="000000"/>
+              <w:bottom w:val="single" w:color="000000" w:sz="8" w:space="0"/>
               <w:right w:val="nil"/>
             </w:tcBorders>
             <w:vAlign w:val="center"/>
@@ -9393,7 +9384,7 @@
             <w:tcBorders>
               <w:top w:val="nil"/>
               <w:left w:val="nil"/>
-              <w:bottom w:val="single" w:sz="8" w:space="0" w:color="000000"/>
+              <w:bottom w:val="single" w:color="000000" w:sz="8" w:space="0"/>
               <w:right w:val="nil"/>
             </w:tcBorders>
             <w:vAlign w:val="center"/>
@@ -9419,7 +9410,7 @@
             <w:tcBorders>
               <w:top w:val="nil"/>
               <w:left w:val="nil"/>
-              <w:bottom w:val="single" w:sz="8" w:space="0" w:color="000000"/>
+              <w:bottom w:val="single" w:color="000000" w:sz="8" w:space="0"/>
               <w:right w:val="nil"/>
             </w:tcBorders>
             <w:vAlign w:val="center"/>
@@ -9451,7 +9442,7 @@
             <w:tcBorders>
               <w:top w:val="nil"/>
               <w:left w:val="nil"/>
-              <w:bottom w:val="single" w:sz="8" w:space="0" w:color="000000"/>
+              <w:bottom w:val="single" w:color="000000" w:sz="8" w:space="0"/>
               <w:right w:val="nil"/>
             </w:tcBorders>
             <w:vAlign w:val="center"/>
@@ -9489,7 +9480,7 @@
             <w:tcBorders>
               <w:top w:val="nil"/>
               <w:left w:val="nil"/>
-              <w:bottom w:val="single" w:sz="8" w:space="0" w:color="000000"/>
+              <w:bottom w:val="single" w:color="000000" w:sz="8" w:space="0"/>
               <w:right w:val="nil"/>
             </w:tcBorders>
             <w:vAlign w:val="center"/>
@@ -9515,7 +9506,7 @@
             <w:tcBorders>
               <w:top w:val="nil"/>
               <w:left w:val="nil"/>
-              <w:bottom w:val="single" w:sz="8" w:space="0" w:color="000000"/>
+              <w:bottom w:val="single" w:color="000000" w:sz="8" w:space="0"/>
               <w:right w:val="nil"/>
             </w:tcBorders>
             <w:vAlign w:val="center"/>
@@ -9547,7 +9538,7 @@
             <w:tcBorders>
               <w:top w:val="nil"/>
               <w:left w:val="nil"/>
-              <w:bottom w:val="single" w:sz="8" w:space="0" w:color="000000"/>
+              <w:bottom w:val="single" w:color="000000" w:sz="8" w:space="0"/>
               <w:right w:val="nil"/>
             </w:tcBorders>
             <w:vAlign w:val="center"/>
@@ -9585,7 +9576,7 @@
             <w:tcBorders>
               <w:top w:val="nil"/>
               <w:left w:val="nil"/>
-              <w:bottom w:val="single" w:sz="8" w:space="0" w:color="000000"/>
+              <w:bottom w:val="single" w:color="000000" w:sz="8" w:space="0"/>
               <w:right w:val="nil"/>
             </w:tcBorders>
             <w:vAlign w:val="center"/>
@@ -9611,7 +9602,7 @@
             <w:tcBorders>
               <w:top w:val="nil"/>
               <w:left w:val="nil"/>
-              <w:bottom w:val="single" w:sz="8" w:space="0" w:color="000000"/>
+              <w:bottom w:val="single" w:color="000000" w:sz="8" w:space="0"/>
               <w:right w:val="nil"/>
             </w:tcBorders>
             <w:vAlign w:val="center"/>
@@ -9643,7 +9634,7 @@
             <w:tcBorders>
               <w:top w:val="nil"/>
               <w:left w:val="nil"/>
-              <w:bottom w:val="single" w:sz="8" w:space="0" w:color="000000"/>
+              <w:bottom w:val="single" w:color="000000" w:sz="8" w:space="0"/>
               <w:right w:val="nil"/>
             </w:tcBorders>
             <w:vAlign w:val="center"/>
@@ -9681,7 +9672,7 @@
             <w:tcBorders>
               <w:top w:val="nil"/>
               <w:left w:val="nil"/>
-              <w:bottom w:val="single" w:sz="12" w:space="0" w:color="000000"/>
+              <w:bottom w:val="single" w:color="000000" w:sz="12" w:space="0"/>
               <w:right w:val="nil"/>
             </w:tcBorders>
             <w:hideMark/>
@@ -9716,7 +9707,7 @@
             <w:tcBorders>
               <w:top w:val="nil"/>
               <w:left w:val="nil"/>
-              <w:bottom w:val="single" w:sz="8" w:space="0" w:color="000000"/>
+              <w:bottom w:val="single" w:color="000000" w:sz="8" w:space="0"/>
               <w:right w:val="nil"/>
             </w:tcBorders>
             <w:vAlign w:val="center"/>
@@ -9748,7 +9739,7 @@
             <w:tcBorders>
               <w:top w:val="nil"/>
               <w:left w:val="nil"/>
-              <w:bottom w:val="single" w:sz="8" w:space="0" w:color="000000"/>
+              <w:bottom w:val="single" w:color="000000" w:sz="8" w:space="0"/>
               <w:right w:val="nil"/>
             </w:tcBorders>
             <w:vAlign w:val="center"/>
@@ -9788,7 +9779,7 @@
             <w:tcBorders>
               <w:top w:val="nil"/>
               <w:left w:val="nil"/>
-              <w:bottom w:val="single" w:sz="12" w:space="0" w:color="000000"/>
+              <w:bottom w:val="single" w:color="000000" w:sz="12" w:space="0"/>
               <w:right w:val="nil"/>
             </w:tcBorders>
             <w:vAlign w:val="center"/>
@@ -9815,7 +9806,7 @@
             <w:tcBorders>
               <w:top w:val="nil"/>
               <w:left w:val="nil"/>
-              <w:bottom w:val="single" w:sz="8" w:space="0" w:color="000000"/>
+              <w:bottom w:val="single" w:color="000000" w:sz="8" w:space="0"/>
               <w:right w:val="nil"/>
             </w:tcBorders>
             <w:vAlign w:val="center"/>
@@ -9847,7 +9838,7 @@
             <w:tcBorders>
               <w:top w:val="nil"/>
               <w:left w:val="nil"/>
-              <w:bottom w:val="single" w:sz="8" w:space="0" w:color="000000"/>
+              <w:bottom w:val="single" w:color="000000" w:sz="8" w:space="0"/>
               <w:right w:val="nil"/>
             </w:tcBorders>
             <w:vAlign w:val="center"/>
@@ -9887,7 +9878,7 @@
             <w:tcBorders>
               <w:top w:val="nil"/>
               <w:left w:val="nil"/>
-              <w:bottom w:val="single" w:sz="12" w:space="0" w:color="000000"/>
+              <w:bottom w:val="single" w:color="000000" w:sz="12" w:space="0"/>
               <w:right w:val="nil"/>
             </w:tcBorders>
             <w:vAlign w:val="center"/>
@@ -9914,7 +9905,7 @@
             <w:tcBorders>
               <w:top w:val="nil"/>
               <w:left w:val="nil"/>
-              <w:bottom w:val="single" w:sz="8" w:space="0" w:color="000000"/>
+              <w:bottom w:val="single" w:color="000000" w:sz="8" w:space="0"/>
               <w:right w:val="nil"/>
             </w:tcBorders>
             <w:vAlign w:val="center"/>
@@ -9946,7 +9937,7 @@
             <w:tcBorders>
               <w:top w:val="nil"/>
               <w:left w:val="nil"/>
-              <w:bottom w:val="single" w:sz="8" w:space="0" w:color="000000"/>
+              <w:bottom w:val="single" w:color="000000" w:sz="8" w:space="0"/>
               <w:right w:val="nil"/>
             </w:tcBorders>
             <w:vAlign w:val="center"/>
@@ -9986,7 +9977,7 @@
             <w:tcBorders>
               <w:top w:val="nil"/>
               <w:left w:val="nil"/>
-              <w:bottom w:val="single" w:sz="12" w:space="0" w:color="000000"/>
+              <w:bottom w:val="single" w:color="000000" w:sz="12" w:space="0"/>
               <w:right w:val="nil"/>
             </w:tcBorders>
             <w:vAlign w:val="center"/>
@@ -10013,7 +10004,7 @@
             <w:tcBorders>
               <w:top w:val="nil"/>
               <w:left w:val="nil"/>
-              <w:bottom w:val="single" w:sz="12" w:space="0" w:color="000000"/>
+              <w:bottom w:val="single" w:color="000000" w:sz="12" w:space="0"/>
               <w:right w:val="nil"/>
             </w:tcBorders>
             <w:vAlign w:val="center"/>
@@ -10045,7 +10036,7 @@
             <w:tcBorders>
               <w:top w:val="nil"/>
               <w:left w:val="nil"/>
-              <w:bottom w:val="single" w:sz="12" w:space="0" w:color="000000"/>
+              <w:bottom w:val="single" w:color="000000" w:sz="12" w:space="0"/>
               <w:right w:val="nil"/>
             </w:tcBorders>
             <w:vAlign w:val="center"/>
@@ -10141,7 +10132,6 @@
         <w:rPr>
           <w:lang w:val="en-US"/>
         </w:rPr>
-        <w:lastRenderedPageBreak/>
         <w:t xml:space="preserve">Value orientation draws on basic human values perspective </w:t>
       </w:r>
       <w:r>
@@ -10408,7 +10398,6 @@
         <w:rPr>
           <w:lang w:val="en-US"/>
         </w:rPr>
-        <w:lastRenderedPageBreak/>
         <w:t>model is 0.559, indicating that approximately 56% of the total variance in getting along is attributable to differences between respondents rather than variation across vignettes, which confirms that individuals cluster strongly in their responses and that a multilevel specification is appropriate.</w:t>
       </w:r>
     </w:p>
@@ -10873,7 +10862,6 @@
           <w:rFonts w:ascii="Times New Roman" w:hAnsi="Times New Roman" w:cs="Times New Roman"/>
           <w:lang w:val="en-US"/>
         </w:rPr>
-        <w:lastRenderedPageBreak/>
         <w:t>Results</w:t>
       </w:r>
     </w:p>
@@ -11071,7 +11059,6 @@
           <w:rFonts w:cs="Times New Roman"/>
           <w:lang w:val="en-US"/>
         </w:rPr>
-        <w:lastRenderedPageBreak/>
         <w:t>reference</w:t>
       </w:r>
       <w:r>
@@ -11284,7 +11271,6 @@
           <w:rFonts w:cs="Times New Roman"/>
           <w:noProof/>
         </w:rPr>
-        <w:lastRenderedPageBreak/>
         <w:drawing>
           <wp:inline distT="0" distB="0" distL="0" distR="0" wp14:anchorId="2251642E" wp14:editId="78F85CAA">
             <wp:extent cx="5608320" cy="2802255"/>
@@ -11408,7 +11394,6 @@
         <w:rPr>
           <w:noProof/>
         </w:rPr>
-        <w:lastRenderedPageBreak/>
         <w:drawing>
           <wp:inline distT="0" distB="0" distL="0" distR="0" wp14:anchorId="020AB703" wp14:editId="6A63FA6F">
             <wp:extent cx="5612130" cy="2806065"/>
@@ -11522,7 +11507,6 @@
         <w:rPr>
           <w:noProof/>
         </w:rPr>
-        <w:lastRenderedPageBreak/>
         <w:drawing>
           <wp:inline distT="0" distB="0" distL="0" distR="0" wp14:anchorId="02EDCFA9" wp14:editId="2A607C61">
             <wp:extent cx="5612130" cy="2806065"/>
@@ -11703,7 +11687,6 @@
         <w:rPr>
           <w:lang w:val="en-US"/>
         </w:rPr>
-        <w:lastRenderedPageBreak/>
         <w:t xml:space="preserve">Discussion and Conclusion </w:t>
       </w:r>
     </w:p>
@@ -12372,7 +12355,6 @@
         <w:rPr>
           <w:lang w:val="en-US"/>
         </w:rPr>
-        <w:lastRenderedPageBreak/>
         <w:t xml:space="preserve">Castillo, J. C., Bonhomme, M., Miranda, D., &amp; Iturra, J. (2023). Social cohesion and attitudinal changes toward migration: A longitudinal perspective amid the COVID-19 pandemic. </w:t>
       </w:r>
       <w:r>
@@ -13124,7 +13106,6 @@
         <w:rPr>
           <w:lang w:val="en-US"/>
         </w:rPr>
-        <w:lastRenderedPageBreak/>
         <w:t xml:space="preserve">Gu, X., &amp; Tse, C. (2018). Abstractness and desirableness in the human values system: Self‐transcendence values are construed more abstractly, but felt more closely than are self‐enhancement values. </w:t>
       </w:r>
       <w:r>
@@ -13826,7 +13807,6 @@
         <w:rPr>
           <w:lang w:val="en-US"/>
         </w:rPr>
-        <w:lastRenderedPageBreak/>
         <w:t xml:space="preserve">Kulin, J., &amp; Svallfors, S. (2013). Class, values, and attitudes towards redistribution: A European comparison. </w:t>
       </w:r>
       <w:r>
@@ -14509,7 +14489,6 @@
         <w:rPr>
           <w:lang w:val="en-US"/>
         </w:rPr>
-        <w:lastRenderedPageBreak/>
         <w:t xml:space="preserve">Portes, A., &amp; Vickstrom, E. (2011). Diversity, Social Capital, and Cohesion. </w:t>
       </w:r>
       <w:r>
@@ -15188,7 +15167,6 @@
         <w:rPr>
           <w:lang w:val="en-US"/>
         </w:rPr>
-        <w:lastRenderedPageBreak/>
         <w:t xml:space="preserve">Torcal, M., &amp; Mainwaring, S. (2003). The Political Recrafting of Social Bases of Party Competition: Chile, 1973–95. </w:t>
       </w:r>
       <w:r>
@@ -15749,7 +15727,6 @@
           <w:szCs w:val="30"/>
           <w:lang w:val="en-US"/>
         </w:rPr>
-        <w:lastRenderedPageBreak/>
         <w:t>SUPPLEMENTARY ONLINE MATERIALS</w:t>
       </w:r>
     </w:p>
@@ -15899,7 +15876,7 @@
         <w:spacing w:after="0"/>
         <w:jc w:val="center"/>
         <w:rPr>
-          <w:rFonts w:ascii="Aptos Narrow" w:eastAsia="Times New Roman" w:hAnsi="Aptos Narrow" w:cs="Times New Roman"/>
+          <w:rFonts w:ascii="Aptos Narrow" w:hAnsi="Aptos Narrow" w:eastAsia="Times New Roman" w:cs="Times New Roman"/>
           <w:color w:val="000000"/>
           <w:kern w:val="0"/>
           <w:sz w:val="20"/>
@@ -15914,7 +15891,7 @@
           <w:footerReference w:type="default" r:id="rId19"/>
           <w:headerReference w:type="first" r:id="rId20"/>
           <w:footerReference w:type="first" r:id="rId21"/>
-          <w:pgSz w:w="12240" w:h="15840"/>
+          <w:pgSz w:w="12240" w:h="15840" w:orient="portrait"/>
           <w:pgMar w:top="1417" w:right="1701" w:bottom="1417" w:left="1701" w:header="708" w:footer="708" w:gutter="0"/>
           <w:cols w:space="708"/>
           <w:docGrid w:linePitch="360"/>
@@ -15929,10 +15906,22 @@
           <w:right w:w="70" w:type="dxa"/>
         </w:tblCellMar>
         <w:tblLook w:val="04A0" w:firstRow="1" w:lastRow="0" w:firstColumn="1" w:lastColumn="0" w:noHBand="0" w:noVBand="1"/>
+        <w:tblPrChange w:author="Guest User" w:date="2026-05-27T09:12:33.583Z" w16du:dateUtc="2026-05-27T09:12:33.583Z" w:id="1029623991">
+          <w:tblPr>
+            <w:tblW w:w="6655" w:type="dxa"/>
+            <w:tblLook w:val="04A0" w:firstRow="1" w:lastRow="0" w:firstColumn="1" w:lastColumn="0" w:noHBand="0" w:noVBand="1"/>
+          </w:tblPr>
+        </w:tblPrChange>
       </w:tblPr>
       <w:tblGrid>
         <w:gridCol w:w="4792"/>
         <w:gridCol w:w="1863"/>
+        <w:tblGridChange w:id="855798296">
+          <w:tblGrid>
+            <w:gridCol w:w="4792"/>
+            <w:gridCol w:w="1863"/>
+          </w:tblGrid>
+        </w:tblGridChange>
       </w:tblGrid>
       <w:tr>
         <w:trPr>
@@ -15945,9 +15934,10 @@
             <w:tcBorders>
               <w:top w:val="nil"/>
               <w:left w:val="nil"/>
-              <w:bottom w:val="single" w:sz="12" w:space="0" w:color="000000"/>
+              <w:bottom w:val="single" w:color="000000" w:themeColor="text1" w:sz="12" w:space="0"/>
               <w:right w:val="nil"/>
             </w:tcBorders>
+            <w:tcMar/>
             <w:vAlign w:val="center"/>
             <w:hideMark/>
           </w:tcPr>
@@ -15956,7 +15946,7 @@
               <w:spacing w:after="0"/>
               <w:jc w:val="center"/>
               <w:rPr>
-                <w:rFonts w:ascii="Aptos Narrow" w:eastAsia="Times New Roman" w:hAnsi="Aptos Narrow" w:cs="Times New Roman"/>
+                <w:rFonts w:ascii="Aptos Narrow" w:hAnsi="Aptos Narrow" w:eastAsia="Times New Roman" w:cs="Times New Roman"/>
                 <w:color w:val="000000"/>
                 <w:kern w:val="0"/>
                 <w:szCs w:val="22"/>
@@ -15966,19 +15956,18 @@
             </w:pPr>
             <w:r>
               <w:rPr>
-                <w:rFonts w:ascii="Aptos Narrow" w:eastAsia="Times New Roman" w:hAnsi="Aptos Narrow" w:cs="Times New Roman"/>
+                <w:rFonts w:ascii="Aptos Narrow" w:hAnsi="Aptos Narrow" w:eastAsia="Times New Roman" w:cs="Times New Roman"/>
                 <w:color w:val="000000"/>
                 <w:kern w:val="0"/>
                 <w:szCs w:val="22"/>
                 <w:lang w:val="en-US" w:eastAsia="es-CL"/>
                 <w14:ligatures w14:val="none"/>
               </w:rPr>
-              <w:lastRenderedPageBreak/>
               <w:t>Table S1: Multilevel</w:t>
             </w:r>
             <w:r>
               <w:rPr>
-                <w:rFonts w:ascii="Aptos Narrow" w:eastAsia="Times New Roman" w:hAnsi="Aptos Narrow" w:cs="Times New Roman"/>
+                <w:rFonts w:ascii="Aptos Narrow" w:hAnsi="Aptos Narrow" w:eastAsia="Times New Roman" w:cs="Times New Roman"/>
                 <w:color w:val="000000"/>
                 <w:kern w:val="0"/>
                 <w:szCs w:val="22"/>
@@ -15989,7 +15978,7 @@
             </w:r>
             <w:r>
               <w:rPr>
-                <w:rFonts w:ascii="Aptos Narrow" w:eastAsia="Times New Roman" w:hAnsi="Aptos Narrow" w:cs="Times New Roman"/>
+                <w:rFonts w:ascii="Aptos Narrow" w:hAnsi="Aptos Narrow" w:eastAsia="Times New Roman" w:cs="Times New Roman"/>
                 <w:color w:val="000000"/>
                 <w:kern w:val="0"/>
                 <w:szCs w:val="22"/>
@@ -16014,6 +16003,7 @@
               <w:bottom w:val="nil"/>
               <w:right w:val="nil"/>
             </w:tcBorders>
+            <w:tcMar/>
             <w:vAlign w:val="center"/>
             <w:hideMark/>
           </w:tcPr>
@@ -16056,6 +16046,7 @@
               <w:bottom w:val="nil"/>
               <w:right w:val="nil"/>
             </w:tcBorders>
+            <w:tcMar/>
             <w:vAlign w:val="center"/>
             <w:hideMark/>
           </w:tcPr>
@@ -16098,11 +16089,12 @@
           <w:tcPr>
             <w:tcW w:w="4792" w:type="dxa"/>
             <w:tcBorders>
-              <w:top w:val="single" w:sz="8" w:space="0" w:color="000000"/>
+              <w:top w:val="single" w:color="000000" w:themeColor="text1" w:sz="8" w:space="0"/>
               <w:left w:val="nil"/>
               <w:bottom w:val="nil"/>
               <w:right w:val="nil"/>
             </w:tcBorders>
+            <w:tcMar/>
             <w:vAlign w:val="center"/>
             <w:hideMark/>
           </w:tcPr>
@@ -16135,11 +16127,12 @@
           <w:tcPr>
             <w:tcW w:w="1863" w:type="dxa"/>
             <w:tcBorders>
-              <w:top w:val="single" w:sz="8" w:space="0" w:color="000000"/>
+              <w:top w:val="single" w:color="000000" w:themeColor="text1" w:sz="8" w:space="0"/>
               <w:left w:val="nil"/>
               <w:bottom w:val="nil"/>
               <w:right w:val="nil"/>
             </w:tcBorders>
+            <w:tcMar/>
             <w:vAlign w:val="center"/>
             <w:hideMark/>
           </w:tcPr>
@@ -16182,6 +16175,7 @@
               <w:bottom w:val="nil"/>
               <w:right w:val="nil"/>
             </w:tcBorders>
+            <w:tcMar/>
             <w:vAlign w:val="center"/>
             <w:hideMark/>
           </w:tcPr>
@@ -16219,6 +16213,7 @@
               <w:bottom w:val="nil"/>
               <w:right w:val="nil"/>
             </w:tcBorders>
+            <w:tcMar/>
             <w:vAlign w:val="center"/>
             <w:hideMark/>
           </w:tcPr>
@@ -16261,6 +16256,7 @@
               <w:bottom w:val="nil"/>
               <w:right w:val="nil"/>
             </w:tcBorders>
+            <w:tcMar/>
             <w:vAlign w:val="center"/>
             <w:hideMark/>
           </w:tcPr>
@@ -16298,6 +16294,7 @@
               <w:bottom w:val="nil"/>
               <w:right w:val="nil"/>
             </w:tcBorders>
+            <w:tcMar/>
             <w:vAlign w:val="center"/>
             <w:hideMark/>
           </w:tcPr>
@@ -16352,6 +16349,7 @@
               <w:bottom w:val="nil"/>
               <w:right w:val="nil"/>
             </w:tcBorders>
+            <w:tcMar/>
             <w:vAlign w:val="center"/>
             <w:hideMark/>
           </w:tcPr>
@@ -16389,6 +16387,7 @@
               <w:bottom w:val="nil"/>
               <w:right w:val="nil"/>
             </w:tcBorders>
+            <w:tcMar/>
             <w:vAlign w:val="center"/>
             <w:hideMark/>
           </w:tcPr>
@@ -16420,6 +16419,7 @@
               <w:bottom w:val="nil"/>
               <w:right w:val="nil"/>
             </w:tcBorders>
+            <w:tcMar/>
             <w:vAlign w:val="center"/>
             <w:hideMark/>
           </w:tcPr>
@@ -16457,6 +16457,7 @@
               <w:bottom w:val="nil"/>
               <w:right w:val="nil"/>
             </w:tcBorders>
+            <w:tcMar/>
             <w:vAlign w:val="center"/>
             <w:hideMark/>
           </w:tcPr>
@@ -16499,6 +16500,7 @@
               <w:bottom w:val="nil"/>
               <w:right w:val="nil"/>
             </w:tcBorders>
+            <w:tcMar/>
             <w:vAlign w:val="center"/>
             <w:hideMark/>
           </w:tcPr>
@@ -16536,6 +16538,7 @@
               <w:bottom w:val="nil"/>
               <w:right w:val="nil"/>
             </w:tcBorders>
+            <w:tcMar/>
             <w:vAlign w:val="center"/>
             <w:hideMark/>
           </w:tcPr>
@@ -16590,6 +16593,7 @@
               <w:bottom w:val="nil"/>
               <w:right w:val="nil"/>
             </w:tcBorders>
+            <w:tcMar/>
             <w:vAlign w:val="center"/>
             <w:hideMark/>
           </w:tcPr>
@@ -16627,6 +16631,7 @@
               <w:bottom w:val="nil"/>
               <w:right w:val="nil"/>
             </w:tcBorders>
+            <w:tcMar/>
             <w:vAlign w:val="center"/>
             <w:hideMark/>
           </w:tcPr>
@@ -16658,6 +16663,7 @@
               <w:bottom w:val="nil"/>
               <w:right w:val="nil"/>
             </w:tcBorders>
+            <w:tcMar/>
             <w:vAlign w:val="center"/>
             <w:hideMark/>
           </w:tcPr>
@@ -16695,6 +16701,7 @@
               <w:bottom w:val="nil"/>
               <w:right w:val="nil"/>
             </w:tcBorders>
+            <w:tcMar/>
             <w:vAlign w:val="center"/>
             <w:hideMark/>
           </w:tcPr>
@@ -16737,6 +16744,7 @@
               <w:bottom w:val="nil"/>
               <w:right w:val="nil"/>
             </w:tcBorders>
+            <w:tcMar/>
             <w:vAlign w:val="center"/>
             <w:hideMark/>
           </w:tcPr>
@@ -16774,6 +16782,7 @@
               <w:bottom w:val="nil"/>
               <w:right w:val="nil"/>
             </w:tcBorders>
+            <w:tcMar/>
             <w:vAlign w:val="center"/>
             <w:hideMark/>
           </w:tcPr>
@@ -16828,6 +16837,7 @@
               <w:bottom w:val="nil"/>
               <w:right w:val="nil"/>
             </w:tcBorders>
+            <w:tcMar/>
             <w:vAlign w:val="center"/>
             <w:hideMark/>
           </w:tcPr>
@@ -16865,6 +16875,7 @@
               <w:bottom w:val="nil"/>
               <w:right w:val="nil"/>
             </w:tcBorders>
+            <w:tcMar/>
             <w:vAlign w:val="center"/>
             <w:hideMark/>
           </w:tcPr>
@@ -16919,6 +16930,7 @@
               <w:bottom w:val="nil"/>
               <w:right w:val="nil"/>
             </w:tcBorders>
+            <w:tcMar/>
             <w:vAlign w:val="center"/>
             <w:hideMark/>
           </w:tcPr>
@@ -16956,6 +16968,7 @@
               <w:bottom w:val="nil"/>
               <w:right w:val="nil"/>
             </w:tcBorders>
+            <w:tcMar/>
             <w:vAlign w:val="center"/>
             <w:hideMark/>
           </w:tcPr>
@@ -16987,6 +17000,7 @@
               <w:bottom w:val="nil"/>
               <w:right w:val="nil"/>
             </w:tcBorders>
+            <w:tcMar/>
             <w:vAlign w:val="center"/>
             <w:hideMark/>
           </w:tcPr>
@@ -17024,6 +17038,7 @@
               <w:bottom w:val="nil"/>
               <w:right w:val="nil"/>
             </w:tcBorders>
+            <w:tcMar/>
             <w:vAlign w:val="center"/>
             <w:hideMark/>
           </w:tcPr>
@@ -17078,6 +17093,7 @@
               <w:bottom w:val="nil"/>
               <w:right w:val="nil"/>
             </w:tcBorders>
+            <w:tcMar/>
             <w:vAlign w:val="center"/>
             <w:hideMark/>
           </w:tcPr>
@@ -17115,6 +17131,7 @@
               <w:bottom w:val="nil"/>
               <w:right w:val="nil"/>
             </w:tcBorders>
+            <w:tcMar/>
             <w:vAlign w:val="center"/>
             <w:hideMark/>
           </w:tcPr>
@@ -17169,6 +17186,7 @@
               <w:bottom w:val="nil"/>
               <w:right w:val="nil"/>
             </w:tcBorders>
+            <w:tcMar/>
             <w:vAlign w:val="center"/>
             <w:hideMark/>
           </w:tcPr>
@@ -17206,6 +17224,7 @@
               <w:bottom w:val="nil"/>
               <w:right w:val="nil"/>
             </w:tcBorders>
+            <w:tcMar/>
             <w:vAlign w:val="center"/>
             <w:hideMark/>
           </w:tcPr>
@@ -17237,6 +17256,7 @@
               <w:bottom w:val="nil"/>
               <w:right w:val="nil"/>
             </w:tcBorders>
+            <w:tcMar/>
             <w:vAlign w:val="center"/>
             <w:hideMark/>
           </w:tcPr>
@@ -17274,6 +17294,7 @@
               <w:bottom w:val="nil"/>
               <w:right w:val="nil"/>
             </w:tcBorders>
+            <w:tcMar/>
             <w:vAlign w:val="center"/>
             <w:hideMark/>
           </w:tcPr>
@@ -17328,6 +17349,7 @@
               <w:bottom w:val="nil"/>
               <w:right w:val="nil"/>
             </w:tcBorders>
+            <w:tcMar/>
             <w:vAlign w:val="center"/>
             <w:hideMark/>
           </w:tcPr>
@@ -17365,6 +17387,7 @@
               <w:bottom w:val="nil"/>
               <w:right w:val="nil"/>
             </w:tcBorders>
+            <w:tcMar/>
             <w:vAlign w:val="center"/>
             <w:hideMark/>
           </w:tcPr>
@@ -17419,6 +17442,7 @@
               <w:bottom w:val="nil"/>
               <w:right w:val="nil"/>
             </w:tcBorders>
+            <w:tcMar/>
             <w:vAlign w:val="center"/>
             <w:hideMark/>
           </w:tcPr>
@@ -17456,6 +17480,7 @@
               <w:bottom w:val="nil"/>
               <w:right w:val="nil"/>
             </w:tcBorders>
+            <w:tcMar/>
             <w:vAlign w:val="center"/>
             <w:hideMark/>
           </w:tcPr>
@@ -17510,6 +17535,7 @@
               <w:bottom w:val="nil"/>
               <w:right w:val="nil"/>
             </w:tcBorders>
+            <w:tcMar/>
             <w:vAlign w:val="center"/>
             <w:hideMark/>
           </w:tcPr>
@@ -17547,6 +17573,7 @@
               <w:bottom w:val="nil"/>
               <w:right w:val="nil"/>
             </w:tcBorders>
+            <w:tcMar/>
             <w:vAlign w:val="center"/>
             <w:hideMark/>
           </w:tcPr>
@@ -17578,6 +17605,7 @@
               <w:bottom w:val="nil"/>
               <w:right w:val="nil"/>
             </w:tcBorders>
+            <w:tcMar/>
             <w:vAlign w:val="center"/>
             <w:hideMark/>
           </w:tcPr>
@@ -17626,6 +17654,7 @@
               <w:bottom w:val="nil"/>
               <w:right w:val="nil"/>
             </w:tcBorders>
+            <w:tcMar/>
             <w:vAlign w:val="center"/>
             <w:hideMark/>
           </w:tcPr>
@@ -17680,6 +17709,7 @@
               <w:bottom w:val="nil"/>
               <w:right w:val="nil"/>
             </w:tcBorders>
+            <w:tcMar/>
             <w:vAlign w:val="center"/>
             <w:hideMark/>
           </w:tcPr>
@@ -17717,6 +17747,7 @@
               <w:bottom w:val="nil"/>
               <w:right w:val="nil"/>
             </w:tcBorders>
+            <w:tcMar/>
             <w:vAlign w:val="center"/>
             <w:hideMark/>
           </w:tcPr>
@@ -17771,6 +17802,7 @@
               <w:bottom w:val="nil"/>
               <w:right w:val="nil"/>
             </w:tcBorders>
+            <w:tcMar/>
             <w:vAlign w:val="center"/>
             <w:hideMark/>
           </w:tcPr>
@@ -17808,6 +17840,7 @@
               <w:bottom w:val="nil"/>
               <w:right w:val="nil"/>
             </w:tcBorders>
+            <w:tcMar/>
             <w:vAlign w:val="center"/>
             <w:hideMark/>
           </w:tcPr>
@@ -17862,6 +17895,7 @@
               <w:bottom w:val="nil"/>
               <w:right w:val="nil"/>
             </w:tcBorders>
+            <w:tcMar/>
             <w:vAlign w:val="center"/>
             <w:hideMark/>
           </w:tcPr>
@@ -17899,6 +17933,7 @@
               <w:bottom w:val="nil"/>
               <w:right w:val="nil"/>
             </w:tcBorders>
+            <w:tcMar/>
             <w:vAlign w:val="center"/>
             <w:hideMark/>
           </w:tcPr>
@@ -17930,6 +17965,7 @@
               <w:bottom w:val="nil"/>
               <w:right w:val="nil"/>
             </w:tcBorders>
+            <w:tcMar/>
             <w:vAlign w:val="center"/>
             <w:hideMark/>
           </w:tcPr>
@@ -17967,6 +18003,7 @@
               <w:bottom w:val="nil"/>
               <w:right w:val="nil"/>
             </w:tcBorders>
+            <w:tcMar/>
             <w:vAlign w:val="center"/>
             <w:hideMark/>
           </w:tcPr>
@@ -18021,6 +18058,7 @@
               <w:bottom w:val="nil"/>
               <w:right w:val="nil"/>
             </w:tcBorders>
+            <w:tcMar/>
             <w:vAlign w:val="center"/>
             <w:hideMark/>
           </w:tcPr>
@@ -18058,6 +18096,7 @@
               <w:bottom w:val="nil"/>
               <w:right w:val="nil"/>
             </w:tcBorders>
+            <w:tcMar/>
             <w:vAlign w:val="center"/>
             <w:hideMark/>
           </w:tcPr>
@@ -18089,6 +18128,7 @@
               <w:bottom w:val="nil"/>
               <w:right w:val="nil"/>
             </w:tcBorders>
+            <w:tcMar/>
             <w:vAlign w:val="center"/>
             <w:hideMark/>
           </w:tcPr>
@@ -18126,6 +18166,7 @@
               <w:bottom w:val="nil"/>
               <w:right w:val="nil"/>
             </w:tcBorders>
+            <w:tcMar/>
             <w:vAlign w:val="center"/>
             <w:hideMark/>
           </w:tcPr>
@@ -18168,6 +18209,7 @@
               <w:bottom w:val="nil"/>
               <w:right w:val="nil"/>
             </w:tcBorders>
+            <w:tcMar/>
             <w:vAlign w:val="center"/>
             <w:hideMark/>
           </w:tcPr>
@@ -18205,6 +18247,7 @@
               <w:bottom w:val="nil"/>
               <w:right w:val="nil"/>
             </w:tcBorders>
+            <w:tcMar/>
             <w:vAlign w:val="center"/>
             <w:hideMark/>
           </w:tcPr>
@@ -18247,6 +18290,7 @@
               <w:bottom w:val="nil"/>
               <w:right w:val="nil"/>
             </w:tcBorders>
+            <w:tcMar/>
             <w:vAlign w:val="center"/>
             <w:hideMark/>
           </w:tcPr>
@@ -18284,6 +18328,7 @@
               <w:bottom w:val="nil"/>
               <w:right w:val="nil"/>
             </w:tcBorders>
+            <w:tcMar/>
             <w:vAlign w:val="center"/>
             <w:hideMark/>
           </w:tcPr>
@@ -18315,6 +18360,7 @@
               <w:bottom w:val="nil"/>
               <w:right w:val="nil"/>
             </w:tcBorders>
+            <w:tcMar/>
             <w:vAlign w:val="center"/>
             <w:hideMark/>
           </w:tcPr>
@@ -18352,6 +18398,7 @@
               <w:bottom w:val="nil"/>
               <w:right w:val="nil"/>
             </w:tcBorders>
+            <w:tcMar/>
             <w:vAlign w:val="center"/>
             <w:hideMark/>
           </w:tcPr>
@@ -18406,6 +18453,7 @@
               <w:bottom w:val="nil"/>
               <w:right w:val="nil"/>
             </w:tcBorders>
+            <w:tcMar/>
             <w:vAlign w:val="center"/>
             <w:hideMark/>
           </w:tcPr>
@@ -18443,6 +18491,7 @@
               <w:bottom w:val="nil"/>
               <w:right w:val="nil"/>
             </w:tcBorders>
+            <w:tcMar/>
             <w:vAlign w:val="center"/>
             <w:hideMark/>
           </w:tcPr>
@@ -18485,6 +18534,7 @@
               <w:bottom w:val="nil"/>
               <w:right w:val="nil"/>
             </w:tcBorders>
+            <w:tcMar/>
             <w:vAlign w:val="center"/>
             <w:hideMark/>
           </w:tcPr>
@@ -18522,6 +18572,7 @@
               <w:bottom w:val="nil"/>
               <w:right w:val="nil"/>
             </w:tcBorders>
+            <w:tcMar/>
             <w:vAlign w:val="center"/>
             <w:hideMark/>
           </w:tcPr>
@@ -18553,6 +18604,7 @@
               <w:bottom w:val="nil"/>
               <w:right w:val="nil"/>
             </w:tcBorders>
+            <w:tcMar/>
             <w:vAlign w:val="center"/>
             <w:hideMark/>
           </w:tcPr>
@@ -18590,6 +18642,7 @@
               <w:bottom w:val="nil"/>
               <w:right w:val="nil"/>
             </w:tcBorders>
+            <w:tcMar/>
             <w:vAlign w:val="center"/>
             <w:hideMark/>
           </w:tcPr>
@@ -18632,6 +18685,7 @@
               <w:bottom w:val="nil"/>
               <w:right w:val="nil"/>
             </w:tcBorders>
+            <w:tcMar/>
             <w:vAlign w:val="center"/>
             <w:hideMark/>
           </w:tcPr>
@@ -18669,6 +18723,7 @@
               <w:bottom w:val="nil"/>
               <w:right w:val="nil"/>
             </w:tcBorders>
+            <w:tcMar/>
             <w:vAlign w:val="center"/>
             <w:hideMark/>
           </w:tcPr>
@@ -18711,6 +18766,7 @@
               <w:bottom w:val="nil"/>
               <w:right w:val="nil"/>
             </w:tcBorders>
+            <w:tcMar/>
             <w:vAlign w:val="center"/>
             <w:hideMark/>
           </w:tcPr>
@@ -18748,6 +18804,7 @@
               <w:bottom w:val="nil"/>
               <w:right w:val="nil"/>
             </w:tcBorders>
+            <w:tcMar/>
             <w:vAlign w:val="center"/>
             <w:hideMark/>
           </w:tcPr>
@@ -18802,6 +18859,7 @@
               <w:bottom w:val="nil"/>
               <w:right w:val="nil"/>
             </w:tcBorders>
+            <w:tcMar/>
             <w:vAlign w:val="center"/>
             <w:hideMark/>
           </w:tcPr>
@@ -18839,6 +18897,7 @@
               <w:bottom w:val="nil"/>
               <w:right w:val="nil"/>
             </w:tcBorders>
+            <w:tcMar/>
             <w:vAlign w:val="center"/>
             <w:hideMark/>
           </w:tcPr>
@@ -18893,6 +18952,7 @@
               <w:bottom w:val="nil"/>
               <w:right w:val="nil"/>
             </w:tcBorders>
+            <w:tcMar/>
             <w:vAlign w:val="center"/>
             <w:hideMark/>
           </w:tcPr>
@@ -18930,6 +18990,7 @@
               <w:bottom w:val="nil"/>
               <w:right w:val="nil"/>
             </w:tcBorders>
+            <w:tcMar/>
             <w:vAlign w:val="center"/>
             <w:hideMark/>
           </w:tcPr>
@@ -18961,6 +19022,7 @@
               <w:bottom w:val="nil"/>
               <w:right w:val="nil"/>
             </w:tcBorders>
+            <w:tcMar/>
             <w:vAlign w:val="center"/>
             <w:hideMark/>
           </w:tcPr>
@@ -18998,6 +19060,7 @@
               <w:bottom w:val="nil"/>
               <w:right w:val="nil"/>
             </w:tcBorders>
+            <w:tcMar/>
             <w:vAlign w:val="center"/>
             <w:hideMark/>
           </w:tcPr>
@@ -19052,6 +19115,7 @@
               <w:bottom w:val="nil"/>
               <w:right w:val="nil"/>
             </w:tcBorders>
+            <w:tcMar/>
             <w:vAlign w:val="center"/>
             <w:hideMark/>
           </w:tcPr>
@@ -19089,6 +19153,7 @@
               <w:bottom w:val="nil"/>
               <w:right w:val="nil"/>
             </w:tcBorders>
+            <w:tcMar/>
             <w:vAlign w:val="center"/>
             <w:hideMark/>
           </w:tcPr>
@@ -19143,6 +19208,7 @@
               <w:bottom w:val="nil"/>
               <w:right w:val="nil"/>
             </w:tcBorders>
+            <w:tcMar/>
             <w:vAlign w:val="center"/>
             <w:hideMark/>
           </w:tcPr>
@@ -19180,6 +19246,7 @@
               <w:bottom w:val="nil"/>
               <w:right w:val="nil"/>
             </w:tcBorders>
+            <w:tcMar/>
             <w:vAlign w:val="center"/>
             <w:hideMark/>
           </w:tcPr>
@@ -19234,6 +19301,7 @@
               <w:bottom w:val="nil"/>
               <w:right w:val="nil"/>
             </w:tcBorders>
+            <w:tcMar/>
             <w:vAlign w:val="center"/>
             <w:hideMark/>
           </w:tcPr>
@@ -19271,6 +19339,7 @@
               <w:bottom w:val="nil"/>
               <w:right w:val="nil"/>
             </w:tcBorders>
+            <w:tcMar/>
             <w:vAlign w:val="center"/>
             <w:hideMark/>
           </w:tcPr>
@@ -19302,6 +19371,7 @@
               <w:bottom w:val="nil"/>
               <w:right w:val="nil"/>
             </w:tcBorders>
+            <w:tcMar/>
             <w:vAlign w:val="center"/>
             <w:hideMark/>
           </w:tcPr>
@@ -19339,6 +19409,7 @@
               <w:bottom w:val="nil"/>
               <w:right w:val="nil"/>
             </w:tcBorders>
+            <w:tcMar/>
             <w:vAlign w:val="center"/>
             <w:hideMark/>
           </w:tcPr>
@@ -19381,6 +19452,7 @@
               <w:bottom w:val="nil"/>
               <w:right w:val="nil"/>
             </w:tcBorders>
+            <w:tcMar/>
             <w:vAlign w:val="center"/>
             <w:hideMark/>
           </w:tcPr>
@@ -19418,6 +19490,7 @@
               <w:bottom w:val="nil"/>
               <w:right w:val="nil"/>
             </w:tcBorders>
+            <w:tcMar/>
             <w:vAlign w:val="center"/>
             <w:hideMark/>
           </w:tcPr>
@@ -19460,6 +19533,7 @@
               <w:bottom w:val="nil"/>
               <w:right w:val="nil"/>
             </w:tcBorders>
+            <w:tcMar/>
             <w:vAlign w:val="center"/>
             <w:hideMark/>
           </w:tcPr>
@@ -19497,6 +19571,7 @@
               <w:bottom w:val="nil"/>
               <w:right w:val="nil"/>
             </w:tcBorders>
+            <w:tcMar/>
             <w:vAlign w:val="center"/>
             <w:hideMark/>
           </w:tcPr>
@@ -19539,6 +19614,7 @@
               <w:bottom w:val="nil"/>
               <w:right w:val="nil"/>
             </w:tcBorders>
+            <w:tcMar/>
             <w:vAlign w:val="center"/>
             <w:hideMark/>
           </w:tcPr>
@@ -19576,6 +19652,7 @@
               <w:bottom w:val="nil"/>
               <w:right w:val="nil"/>
             </w:tcBorders>
+            <w:tcMar/>
             <w:vAlign w:val="center"/>
             <w:hideMark/>
           </w:tcPr>
@@ -19630,6 +19707,7 @@
               <w:bottom w:val="nil"/>
               <w:right w:val="nil"/>
             </w:tcBorders>
+            <w:tcMar/>
             <w:vAlign w:val="center"/>
             <w:hideMark/>
           </w:tcPr>
@@ -19667,6 +19745,7 @@
               <w:bottom w:val="nil"/>
               <w:right w:val="nil"/>
             </w:tcBorders>
+            <w:tcMar/>
             <w:vAlign w:val="center"/>
             <w:hideMark/>
           </w:tcPr>
@@ -19698,6 +19777,7 @@
               <w:bottom w:val="nil"/>
               <w:right w:val="nil"/>
             </w:tcBorders>
+            <w:tcMar/>
             <w:vAlign w:val="center"/>
             <w:hideMark/>
           </w:tcPr>
@@ -19746,6 +19826,7 @@
               <w:bottom w:val="nil"/>
               <w:right w:val="nil"/>
             </w:tcBorders>
+            <w:tcMar/>
             <w:vAlign w:val="center"/>
             <w:hideMark/>
           </w:tcPr>
@@ -19800,6 +19881,7 @@
               <w:bottom w:val="nil"/>
               <w:right w:val="nil"/>
             </w:tcBorders>
+            <w:tcMar/>
             <w:vAlign w:val="center"/>
             <w:hideMark/>
           </w:tcPr>
@@ -19837,6 +19919,7 @@
               <w:bottom w:val="nil"/>
               <w:right w:val="nil"/>
             </w:tcBorders>
+            <w:tcMar/>
             <w:vAlign w:val="center"/>
             <w:hideMark/>
           </w:tcPr>
@@ -19891,6 +19974,7 @@
               <w:bottom w:val="nil"/>
               <w:right w:val="nil"/>
             </w:tcBorders>
+            <w:tcMar/>
             <w:vAlign w:val="center"/>
             <w:hideMark/>
           </w:tcPr>
@@ -19928,6 +20012,7 @@
               <w:bottom w:val="nil"/>
               <w:right w:val="nil"/>
             </w:tcBorders>
+            <w:tcMar/>
             <w:vAlign w:val="center"/>
             <w:hideMark/>
           </w:tcPr>
@@ -19982,6 +20067,7 @@
               <w:bottom w:val="nil"/>
               <w:right w:val="nil"/>
             </w:tcBorders>
+            <w:tcMar/>
             <w:vAlign w:val="center"/>
             <w:hideMark/>
           </w:tcPr>
@@ -20019,6 +20105,7 @@
               <w:bottom w:val="nil"/>
               <w:right w:val="nil"/>
             </w:tcBorders>
+            <w:tcMar/>
             <w:vAlign w:val="center"/>
             <w:hideMark/>
           </w:tcPr>
@@ -20061,6 +20148,7 @@
               <w:bottom w:val="nil"/>
               <w:right w:val="nil"/>
             </w:tcBorders>
+            <w:tcMar/>
             <w:vAlign w:val="center"/>
             <w:hideMark/>
           </w:tcPr>
@@ -20098,6 +20186,7 @@
               <w:bottom w:val="nil"/>
               <w:right w:val="nil"/>
             </w:tcBorders>
+            <w:tcMar/>
             <w:vAlign w:val="center"/>
             <w:hideMark/>
           </w:tcPr>
@@ -20140,6 +20229,7 @@
               <w:bottom w:val="nil"/>
               <w:right w:val="nil"/>
             </w:tcBorders>
+            <w:tcMar/>
             <w:vAlign w:val="center"/>
             <w:hideMark/>
           </w:tcPr>
@@ -20177,6 +20267,7 @@
               <w:bottom w:val="nil"/>
               <w:right w:val="nil"/>
             </w:tcBorders>
+            <w:tcMar/>
             <w:vAlign w:val="center"/>
             <w:hideMark/>
           </w:tcPr>
@@ -20208,6 +20299,7 @@
               <w:bottom w:val="nil"/>
               <w:right w:val="nil"/>
             </w:tcBorders>
+            <w:tcMar/>
             <w:vAlign w:val="center"/>
             <w:hideMark/>
           </w:tcPr>
@@ -20245,6 +20337,7 @@
               <w:bottom w:val="nil"/>
               <w:right w:val="nil"/>
             </w:tcBorders>
+            <w:tcMar/>
             <w:vAlign w:val="center"/>
             <w:hideMark/>
           </w:tcPr>
@@ -20299,6 +20392,7 @@
               <w:bottom w:val="nil"/>
               <w:right w:val="nil"/>
             </w:tcBorders>
+            <w:tcMar/>
             <w:vAlign w:val="center"/>
             <w:hideMark/>
           </w:tcPr>
@@ -20336,6 +20430,7 @@
               <w:bottom w:val="nil"/>
               <w:right w:val="nil"/>
             </w:tcBorders>
+            <w:tcMar/>
             <w:vAlign w:val="center"/>
             <w:hideMark/>
           </w:tcPr>
@@ -20390,6 +20485,7 @@
               <w:bottom w:val="nil"/>
               <w:right w:val="nil"/>
             </w:tcBorders>
+            <w:tcMar/>
             <w:vAlign w:val="center"/>
             <w:hideMark/>
           </w:tcPr>
@@ -20427,6 +20523,7 @@
               <w:bottom w:val="nil"/>
               <w:right w:val="nil"/>
             </w:tcBorders>
+            <w:tcMar/>
             <w:vAlign w:val="center"/>
             <w:hideMark/>
           </w:tcPr>
@@ -20481,6 +20578,7 @@
               <w:bottom w:val="nil"/>
               <w:right w:val="nil"/>
             </w:tcBorders>
+            <w:tcMar/>
             <w:vAlign w:val="center"/>
             <w:hideMark/>
           </w:tcPr>
@@ -20518,6 +20616,7 @@
               <w:bottom w:val="nil"/>
               <w:right w:val="nil"/>
             </w:tcBorders>
+            <w:tcMar/>
             <w:vAlign w:val="center"/>
             <w:hideMark/>
           </w:tcPr>
@@ -20549,6 +20648,7 @@
               <w:bottom w:val="nil"/>
               <w:right w:val="nil"/>
             </w:tcBorders>
+            <w:tcMar/>
             <w:vAlign w:val="center"/>
             <w:hideMark/>
           </w:tcPr>
@@ -20597,6 +20697,7 @@
               <w:bottom w:val="nil"/>
               <w:right w:val="nil"/>
             </w:tcBorders>
+            <w:tcMar/>
             <w:vAlign w:val="center"/>
             <w:hideMark/>
           </w:tcPr>
@@ -20639,6 +20740,7 @@
               <w:bottom w:val="nil"/>
               <w:right w:val="nil"/>
             </w:tcBorders>
+            <w:tcMar/>
             <w:vAlign w:val="center"/>
             <w:hideMark/>
           </w:tcPr>
@@ -20676,6 +20778,7 @@
               <w:bottom w:val="nil"/>
               <w:right w:val="nil"/>
             </w:tcBorders>
+            <w:tcMar/>
             <w:vAlign w:val="center"/>
             <w:hideMark/>
           </w:tcPr>
@@ -20718,6 +20821,7 @@
               <w:bottom w:val="nil"/>
               <w:right w:val="nil"/>
             </w:tcBorders>
+            <w:tcMar/>
             <w:vAlign w:val="center"/>
             <w:hideMark/>
           </w:tcPr>
@@ -20755,6 +20859,7 @@
               <w:bottom w:val="nil"/>
               <w:right w:val="nil"/>
             </w:tcBorders>
+            <w:tcMar/>
             <w:vAlign w:val="center"/>
             <w:hideMark/>
           </w:tcPr>
@@ -20809,6 +20914,7 @@
               <w:bottom w:val="nil"/>
               <w:right w:val="nil"/>
             </w:tcBorders>
+            <w:tcMar/>
             <w:vAlign w:val="center"/>
             <w:hideMark/>
           </w:tcPr>
@@ -20846,6 +20952,7 @@
               <w:bottom w:val="nil"/>
               <w:right w:val="nil"/>
             </w:tcBorders>
+            <w:tcMar/>
             <w:vAlign w:val="center"/>
             <w:hideMark/>
           </w:tcPr>
@@ -20877,6 +20984,7 @@
               <w:bottom w:val="nil"/>
               <w:right w:val="nil"/>
             </w:tcBorders>
+            <w:tcMar/>
             <w:vAlign w:val="center"/>
             <w:hideMark/>
           </w:tcPr>
@@ -20914,6 +21022,7 @@
               <w:bottom w:val="nil"/>
               <w:right w:val="nil"/>
             </w:tcBorders>
+            <w:tcMar/>
             <w:vAlign w:val="center"/>
             <w:hideMark/>
           </w:tcPr>
@@ -20956,6 +21065,7 @@
               <w:bottom w:val="nil"/>
               <w:right w:val="nil"/>
             </w:tcBorders>
+            <w:tcMar/>
             <w:vAlign w:val="center"/>
             <w:hideMark/>
           </w:tcPr>
@@ -20993,6 +21103,7 @@
               <w:bottom w:val="nil"/>
               <w:right w:val="nil"/>
             </w:tcBorders>
+            <w:tcMar/>
             <w:vAlign w:val="center"/>
             <w:hideMark/>
           </w:tcPr>
@@ -21024,6 +21135,7 @@
               <w:bottom w:val="nil"/>
               <w:right w:val="nil"/>
             </w:tcBorders>
+            <w:tcMar/>
             <w:vAlign w:val="center"/>
             <w:hideMark/>
           </w:tcPr>
@@ -21061,6 +21173,7 @@
               <w:bottom w:val="nil"/>
               <w:right w:val="nil"/>
             </w:tcBorders>
+            <w:tcMar/>
             <w:vAlign w:val="center"/>
             <w:hideMark/>
           </w:tcPr>
@@ -21103,6 +21216,7 @@
               <w:bottom w:val="nil"/>
               <w:right w:val="nil"/>
             </w:tcBorders>
+            <w:tcMar/>
             <w:vAlign w:val="center"/>
             <w:hideMark/>
           </w:tcPr>
@@ -21140,6 +21254,7 @@
               <w:bottom w:val="nil"/>
               <w:right w:val="nil"/>
             </w:tcBorders>
+            <w:tcMar/>
             <w:vAlign w:val="center"/>
             <w:hideMark/>
           </w:tcPr>
@@ -21182,6 +21297,7 @@
               <w:bottom w:val="nil"/>
               <w:right w:val="nil"/>
             </w:tcBorders>
+            <w:tcMar/>
             <w:vAlign w:val="center"/>
             <w:hideMark/>
           </w:tcPr>
@@ -21219,6 +21335,7 @@
               <w:bottom w:val="nil"/>
               <w:right w:val="nil"/>
             </w:tcBorders>
+            <w:tcMar/>
             <w:vAlign w:val="center"/>
             <w:hideMark/>
           </w:tcPr>
@@ -21244,6 +21361,223 @@
                 <w14:ligatures w14:val="none"/>
               </w:rPr>
               <w:t>0.122 (0.047)</w:t>
+            </w:r>
+            <w:r>
+              <w:rPr>
+                <w:rFonts w:eastAsia="Times New Roman" w:cs="Times New Roman"/>
+                <w:color w:val="000000"/>
+                <w:kern w:val="0"/>
+                <w:szCs w:val="22"/>
+                <w:vertAlign w:val="superscript"/>
+                <w:lang w:eastAsia="es-CL"/>
+                <w14:ligatures w14:val="none"/>
+              </w:rPr>
+              <w:t>*</w:t>
+            </w:r>
+          </w:p>
+        </w:tc>
+      </w:tr>
+      <w:tr>
+        <w:trPr>
+          <w:trHeight w:val="300"/>
+          <w:trPrChange w:author="Guest User" w:date="2026-05-27T09:12:33.896Z" w16du:dateUtc="2026-05-27T09:12:33.896Z" w:id="35117765">
+            <w:trPr>
+              <w:trHeight w:val="16"/>
+            </w:trPr>
+          </w:trPrChange>
+        </w:trPr>
+        <w:tc>
+          <w:tcPr>
+            <w:tcW w:w="4792" w:type="dxa"/>
+            <w:tcBorders>
+              <w:top w:val="nil"/>
+              <w:left w:val="nil"/>
+              <w:bottom w:val="nil"/>
+              <w:right w:val="nil"/>
+            </w:tcBorders>
+            <w:tcMar/>
+            <w:vAlign w:val="center"/>
+            <w:hideMark/>
+            <w:tcPrChange w:author="Guest User" w:date="2026-05-27T09:12:33.582Z" w:id="86142371">
+              <w:tcPr>
+                <w:tcW w:w="4792" w:type="dxa"/>
+                <w:tcBorders>
+                  <w:top w:val="nil"/>
+                  <w:left w:val="nil"/>
+                  <w:bottom w:val="nil"/>
+                  <w:right w:val="nil"/>
+                </w:tcBorders>
+                <w:tcMar/>
+                <w:vAlign w:val="center"/>
+              </w:tcPr>
+            </w:tcPrChange>
+          </w:tcPr>
+          <w:p>
+            <w:pPr>
+              <w:spacing w:after="0"/>
+              <w:rPr>
+                <w:rFonts w:eastAsia="Times New Roman" w:cs="Times New Roman"/>
+                <w:color w:val="000000"/>
+                <w:kern w:val="0"/>
+                <w:szCs w:val="22"/>
+                <w:lang w:eastAsia="es-CL"/>
+                <w14:ligatures w14:val="none"/>
+              </w:rPr>
+            </w:pPr>
+            <w:r>
+              <w:rPr>
+                <w:rFonts w:eastAsia="Times New Roman" w:cs="Times New Roman"/>
+                <w:color w:val="000000"/>
+                <w:kern w:val="0"/>
+                <w:szCs w:val="22"/>
+                <w:lang w:eastAsia="es-CL"/>
+                <w14:ligatures w14:val="none"/>
+              </w:rPr>
+              <w:t>     — 55–64</w:t>
+            </w:r>
+          </w:p>
+        </w:tc>
+        <w:tc>
+          <w:tcPr>
+            <w:tcW w:w="1863" w:type="dxa"/>
+            <w:tcBorders>
+              <w:top w:val="nil"/>
+              <w:left w:val="nil"/>
+              <w:bottom w:val="nil"/>
+              <w:right w:val="nil"/>
+            </w:tcBorders>
+            <w:tcMar/>
+            <w:vAlign w:val="center"/>
+            <w:hideMark/>
+            <w:tcPrChange w:author="Guest User" w:date="2026-05-27T09:12:33.582Z" w:id="1983594728">
+              <w:tcPr>
+                <w:tcW w:w="1863" w:type="dxa"/>
+                <w:tcBorders>
+                  <w:top w:val="nil"/>
+                  <w:left w:val="nil"/>
+                  <w:bottom w:val="nil"/>
+                  <w:right w:val="nil"/>
+                </w:tcBorders>
+                <w:tcMar/>
+                <w:vAlign w:val="center"/>
+              </w:tcPr>
+            </w:tcPrChange>
+          </w:tcPr>
+          <w:p>
+            <w:pPr>
+              <w:spacing w:after="0"/>
+              <w:rPr>
+                <w:rFonts w:eastAsia="Times New Roman" w:cs="Times New Roman"/>
+                <w:color w:val="000000"/>
+                <w:kern w:val="0"/>
+                <w:szCs w:val="22"/>
+                <w:lang w:eastAsia="es-CL"/>
+                <w14:ligatures w14:val="none"/>
+              </w:rPr>
+            </w:pPr>
+            <w:r>
+              <w:rPr>
+                <w:rFonts w:eastAsia="Times New Roman" w:cs="Times New Roman"/>
+                <w:color w:val="000000"/>
+                <w:kern w:val="0"/>
+                <w:szCs w:val="22"/>
+                <w:lang w:eastAsia="es-CL"/>
+                <w14:ligatures w14:val="none"/>
+              </w:rPr>
+              <w:t>0.160 (0.049)</w:t>
+            </w:r>
+            <w:r>
+              <w:rPr>
+                <w:rFonts w:eastAsia="Times New Roman" w:cs="Times New Roman"/>
+                <w:color w:val="000000"/>
+                <w:kern w:val="0"/>
+                <w:szCs w:val="22"/>
+                <w:vertAlign w:val="superscript"/>
+                <w:lang w:eastAsia="es-CL"/>
+                <w14:ligatures w14:val="none"/>
+              </w:rPr>
+              <w:t>**</w:t>
+            </w:r>
+          </w:p>
+        </w:tc>
+      </w:tr>
+      <w:tr>
+        <w:trPr>
+          <w:trHeight w:val="16"/>
+        </w:trPr>
+        <w:tc>
+          <w:tcPr>
+            <w:tcW w:w="4792" w:type="dxa"/>
+            <w:tcBorders>
+              <w:top w:val="nil"/>
+              <w:left w:val="nil"/>
+              <w:bottom w:val="nil"/>
+              <w:right w:val="nil"/>
+            </w:tcBorders>
+            <w:tcMar/>
+            <w:vAlign w:val="center"/>
+            <w:hideMark/>
+          </w:tcPr>
+          <w:p>
+            <w:pPr>
+              <w:spacing w:after="0"/>
+              <w:rPr>
+                <w:rFonts w:eastAsia="Times New Roman" w:cs="Times New Roman"/>
+                <w:color w:val="000000"/>
+                <w:kern w:val="0"/>
+                <w:szCs w:val="22"/>
+                <w:lang w:eastAsia="es-CL"/>
+                <w14:ligatures w14:val="none"/>
+              </w:rPr>
+            </w:pPr>
+            <w:r>
+              <w:rPr>
+                <w:rFonts w:eastAsia="Times New Roman" w:cs="Times New Roman"/>
+                <w:color w:val="000000"/>
+                <w:kern w:val="0"/>
+                <w:szCs w:val="22"/>
+                <w:lang w:eastAsia="es-CL"/>
+                <w14:ligatures w14:val="none"/>
+              </w:rPr>
+              <w:t>     — 65–74</w:t>
+            </w:r>
+          </w:p>
+        </w:tc>
+        <w:tc>
+          <w:tcPr>
+            <w:tcW w:w="1863" w:type="dxa"/>
+            <w:tcBorders>
+              <w:top w:val="nil"/>
+              <w:left w:val="nil"/>
+              <w:bottom w:val="nil"/>
+              <w:right w:val="nil"/>
+            </w:tcBorders>
+            <w:tcMar/>
+            <w:vAlign w:val="center"/>
+            <w:hideMark/>
+          </w:tcPr>
+          <w:p>
+            <w:pPr>
+              <w:spacing w:after="0"/>
+              <w:rPr>
+                <w:rFonts w:eastAsia="Times New Roman" w:cs="Times New Roman"/>
+                <w:color w:val="000000"/>
+                <w:kern w:val="0"/>
+                <w:szCs w:val="22"/>
+                <w:lang w:eastAsia="es-CL"/>
+                <w14:ligatures w14:val="none"/>
+              </w:rPr>
+            </w:pPr>
+            <w:r>
+              <w:rPr>
+                <w:rFonts w:eastAsia="Times New Roman" w:cs="Times New Roman"/>
+                <w:color w:val="000000"/>
+                <w:kern w:val="0"/>
+                <w:szCs w:val="22"/>
+                <w:lang w:eastAsia="es-CL"/>
+                <w14:ligatures w14:val="none"/>
+              </w:rPr>
+              <w:t>0.111 (0.053)</w:t>
             </w:r>
             <w:r>
               <w:rPr>
@@ -21273,188 +21607,7 @@
               <w:bottom w:val="nil"/>
               <w:right w:val="nil"/>
             </w:tcBorders>
-            <w:vAlign w:val="center"/>
-            <w:hideMark/>
-          </w:tcPr>
-          <w:p>
-            <w:pPr>
-              <w:spacing w:after="0"/>
-              <w:rPr>
-                <w:rFonts w:eastAsia="Times New Roman" w:cs="Times New Roman"/>
-                <w:color w:val="000000"/>
-                <w:kern w:val="0"/>
-                <w:szCs w:val="22"/>
-                <w:lang w:eastAsia="es-CL"/>
-                <w14:ligatures w14:val="none"/>
-              </w:rPr>
-            </w:pPr>
-            <w:r>
-              <w:rPr>
-                <w:rFonts w:eastAsia="Times New Roman" w:cs="Times New Roman"/>
-                <w:color w:val="000000"/>
-                <w:kern w:val="0"/>
-                <w:szCs w:val="22"/>
-                <w:lang w:eastAsia="es-CL"/>
-                <w14:ligatures w14:val="none"/>
-              </w:rPr>
-              <w:t>     — 55–64</w:t>
-            </w:r>
-          </w:p>
-        </w:tc>
-        <w:tc>
-          <w:tcPr>
-            <w:tcW w:w="1863" w:type="dxa"/>
-            <w:tcBorders>
-              <w:top w:val="nil"/>
-              <w:left w:val="nil"/>
-              <w:bottom w:val="nil"/>
-              <w:right w:val="nil"/>
-            </w:tcBorders>
-            <w:vAlign w:val="center"/>
-            <w:hideMark/>
-          </w:tcPr>
-          <w:p>
-            <w:pPr>
-              <w:spacing w:after="0"/>
-              <w:rPr>
-                <w:rFonts w:eastAsia="Times New Roman" w:cs="Times New Roman"/>
-                <w:color w:val="000000"/>
-                <w:kern w:val="0"/>
-                <w:szCs w:val="22"/>
-                <w:lang w:eastAsia="es-CL"/>
-                <w14:ligatures w14:val="none"/>
-              </w:rPr>
-            </w:pPr>
-            <w:r>
-              <w:rPr>
-                <w:rFonts w:eastAsia="Times New Roman" w:cs="Times New Roman"/>
-                <w:color w:val="000000"/>
-                <w:kern w:val="0"/>
-                <w:szCs w:val="22"/>
-                <w:lang w:eastAsia="es-CL"/>
-                <w14:ligatures w14:val="none"/>
-              </w:rPr>
-              <w:t>0.160 (0.049)</w:t>
-            </w:r>
-            <w:r>
-              <w:rPr>
-                <w:rFonts w:eastAsia="Times New Roman" w:cs="Times New Roman"/>
-                <w:color w:val="000000"/>
-                <w:kern w:val="0"/>
-                <w:szCs w:val="22"/>
-                <w:vertAlign w:val="superscript"/>
-                <w:lang w:eastAsia="es-CL"/>
-                <w14:ligatures w14:val="none"/>
-              </w:rPr>
-              <w:t>**</w:t>
-            </w:r>
-          </w:p>
-        </w:tc>
-      </w:tr>
-      <w:tr>
-        <w:trPr>
-          <w:trHeight w:val="16"/>
-        </w:trPr>
-        <w:tc>
-          <w:tcPr>
-            <w:tcW w:w="4792" w:type="dxa"/>
-            <w:tcBorders>
-              <w:top w:val="nil"/>
-              <w:left w:val="nil"/>
-              <w:bottom w:val="nil"/>
-              <w:right w:val="nil"/>
-            </w:tcBorders>
-            <w:vAlign w:val="center"/>
-            <w:hideMark/>
-          </w:tcPr>
-          <w:p>
-            <w:pPr>
-              <w:spacing w:after="0"/>
-              <w:rPr>
-                <w:rFonts w:eastAsia="Times New Roman" w:cs="Times New Roman"/>
-                <w:color w:val="000000"/>
-                <w:kern w:val="0"/>
-                <w:szCs w:val="22"/>
-                <w:lang w:eastAsia="es-CL"/>
-                <w14:ligatures w14:val="none"/>
-              </w:rPr>
-            </w:pPr>
-            <w:r>
-              <w:rPr>
-                <w:rFonts w:eastAsia="Times New Roman" w:cs="Times New Roman"/>
-                <w:color w:val="000000"/>
-                <w:kern w:val="0"/>
-                <w:szCs w:val="22"/>
-                <w:lang w:eastAsia="es-CL"/>
-                <w14:ligatures w14:val="none"/>
-              </w:rPr>
-              <w:t>     — 65–74</w:t>
-            </w:r>
-          </w:p>
-        </w:tc>
-        <w:tc>
-          <w:tcPr>
-            <w:tcW w:w="1863" w:type="dxa"/>
-            <w:tcBorders>
-              <w:top w:val="nil"/>
-              <w:left w:val="nil"/>
-              <w:bottom w:val="nil"/>
-              <w:right w:val="nil"/>
-            </w:tcBorders>
-            <w:vAlign w:val="center"/>
-            <w:hideMark/>
-          </w:tcPr>
-          <w:p>
-            <w:pPr>
-              <w:spacing w:after="0"/>
-              <w:rPr>
-                <w:rFonts w:eastAsia="Times New Roman" w:cs="Times New Roman"/>
-                <w:color w:val="000000"/>
-                <w:kern w:val="0"/>
-                <w:szCs w:val="22"/>
-                <w:lang w:eastAsia="es-CL"/>
-                <w14:ligatures w14:val="none"/>
-              </w:rPr>
-            </w:pPr>
-            <w:r>
-              <w:rPr>
-                <w:rFonts w:eastAsia="Times New Roman" w:cs="Times New Roman"/>
-                <w:color w:val="000000"/>
-                <w:kern w:val="0"/>
-                <w:szCs w:val="22"/>
-                <w:lang w:eastAsia="es-CL"/>
-                <w14:ligatures w14:val="none"/>
-              </w:rPr>
-              <w:t>0.111 (0.053)</w:t>
-            </w:r>
-            <w:r>
-              <w:rPr>
-                <w:rFonts w:eastAsia="Times New Roman" w:cs="Times New Roman"/>
-                <w:color w:val="000000"/>
-                <w:kern w:val="0"/>
-                <w:szCs w:val="22"/>
-                <w:vertAlign w:val="superscript"/>
-                <w:lang w:eastAsia="es-CL"/>
-                <w14:ligatures w14:val="none"/>
-              </w:rPr>
-              <w:t>*</w:t>
-            </w:r>
-          </w:p>
-        </w:tc>
-      </w:tr>
-      <w:tr>
-        <w:trPr>
-          <w:trHeight w:val="16"/>
-        </w:trPr>
-        <w:tc>
-          <w:tcPr>
-            <w:tcW w:w="4792" w:type="dxa"/>
-            <w:tcBorders>
-              <w:top w:val="nil"/>
-              <w:left w:val="nil"/>
-              <w:bottom w:val="nil"/>
-              <w:right w:val="nil"/>
-            </w:tcBorders>
+            <w:tcMar/>
             <w:vAlign w:val="center"/>
             <w:hideMark/>
           </w:tcPr>
@@ -21492,6 +21645,7 @@
               <w:bottom w:val="nil"/>
               <w:right w:val="nil"/>
             </w:tcBorders>
+            <w:tcMar/>
             <w:vAlign w:val="center"/>
             <w:hideMark/>
           </w:tcPr>
@@ -21534,6 +21688,7 @@
               <w:bottom w:val="nil"/>
               <w:right w:val="nil"/>
             </w:tcBorders>
+            <w:tcMar/>
             <w:vAlign w:val="center"/>
             <w:hideMark/>
           </w:tcPr>
@@ -21571,6 +21726,7 @@
               <w:bottom w:val="nil"/>
               <w:right w:val="nil"/>
             </w:tcBorders>
+            <w:tcMar/>
             <w:vAlign w:val="center"/>
             <w:hideMark/>
           </w:tcPr>
@@ -21608,11 +21764,12 @@
           <w:tcPr>
             <w:tcW w:w="4792" w:type="dxa"/>
             <w:tcBorders>
-              <w:top w:val="single" w:sz="8" w:space="0" w:color="000000"/>
+              <w:top w:val="single" w:color="000000" w:themeColor="text1" w:sz="8" w:space="0"/>
               <w:left w:val="nil"/>
               <w:bottom w:val="nil"/>
               <w:right w:val="nil"/>
             </w:tcBorders>
+            <w:tcMar/>
             <w:vAlign w:val="center"/>
             <w:hideMark/>
           </w:tcPr>
@@ -21645,11 +21802,12 @@
           <w:tcPr>
             <w:tcW w:w="1863" w:type="dxa"/>
             <w:tcBorders>
-              <w:top w:val="single" w:sz="8" w:space="0" w:color="000000"/>
+              <w:top w:val="single" w:color="000000" w:themeColor="text1" w:sz="8" w:space="0"/>
               <w:left w:val="nil"/>
               <w:bottom w:val="nil"/>
               <w:right w:val="nil"/>
             </w:tcBorders>
+            <w:tcMar/>
             <w:vAlign w:val="center"/>
             <w:hideMark/>
           </w:tcPr>
@@ -21693,6 +21851,7 @@
               <w:bottom w:val="nil"/>
               <w:right w:val="nil"/>
             </w:tcBorders>
+            <w:tcMar/>
             <w:vAlign w:val="center"/>
             <w:hideMark/>
           </w:tcPr>
@@ -21730,6 +21889,7 @@
               <w:bottom w:val="nil"/>
               <w:right w:val="nil"/>
             </w:tcBorders>
+            <w:tcMar/>
             <w:vAlign w:val="center"/>
             <w:hideMark/>
           </w:tcPr>
@@ -21773,6 +21933,7 @@
               <w:bottom w:val="nil"/>
               <w:right w:val="nil"/>
             </w:tcBorders>
+            <w:tcMar/>
             <w:vAlign w:val="center"/>
             <w:hideMark/>
           </w:tcPr>
@@ -21810,6 +21971,7 @@
               <w:bottom w:val="nil"/>
               <w:right w:val="nil"/>
             </w:tcBorders>
+            <w:tcMar/>
             <w:vAlign w:val="center"/>
             <w:hideMark/>
           </w:tcPr>
@@ -21853,6 +22015,7 @@
               <w:bottom w:val="nil"/>
               <w:right w:val="nil"/>
             </w:tcBorders>
+            <w:tcMar/>
             <w:vAlign w:val="center"/>
             <w:hideMark/>
           </w:tcPr>
@@ -21890,6 +22053,7 @@
               <w:bottom w:val="nil"/>
               <w:right w:val="nil"/>
             </w:tcBorders>
+            <w:tcMar/>
             <w:vAlign w:val="center"/>
             <w:hideMark/>
           </w:tcPr>
@@ -21930,9 +22094,10 @@
             <w:tcBorders>
               <w:top w:val="nil"/>
               <w:left w:val="nil"/>
-              <w:bottom w:val="single" w:sz="12" w:space="0" w:color="000000"/>
+              <w:bottom w:val="single" w:color="000000" w:themeColor="text1" w:sz="12" w:space="0"/>
               <w:right w:val="nil"/>
             </w:tcBorders>
+            <w:tcMar/>
             <w:vAlign w:val="center"/>
             <w:hideMark/>
           </w:tcPr>
@@ -21967,9 +22132,10 @@
             <w:tcBorders>
               <w:top w:val="nil"/>
               <w:left w:val="nil"/>
-              <w:bottom w:val="single" w:sz="12" w:space="0" w:color="000000"/>
+              <w:bottom w:val="single" w:color="000000" w:themeColor="text1" w:sz="12" w:space="0"/>
               <w:right w:val="nil"/>
             </w:tcBorders>
+            <w:tcMar/>
             <w:vAlign w:val="center"/>
             <w:hideMark/>
           </w:tcPr>
@@ -22009,11 +22175,12 @@
             <w:tcW w:w="6655" w:type="dxa"/>
             <w:gridSpan w:val="2"/>
             <w:tcBorders>
-              <w:top w:val="single" w:sz="12" w:space="0" w:color="000000"/>
+              <w:top w:val="single" w:color="000000" w:themeColor="text1" w:sz="12" w:space="0"/>
               <w:left w:val="nil"/>
               <w:bottom w:val="nil"/>
               <w:right w:val="nil"/>
             </w:tcBorders>
+            <w:tcMar/>
             <w:vAlign w:val="center"/>
             <w:hideMark/>
           </w:tcPr>
@@ -22057,6 +22224,7 @@
               <w:bottom w:val="nil"/>
               <w:right w:val="nil"/>
             </w:tcBorders>
+            <w:tcMar/>
             <w:vAlign w:val="center"/>
             <w:hideMark/>
           </w:tcPr>
@@ -22100,6 +22268,7 @@
               <w:bottom w:val="nil"/>
               <w:right w:val="nil"/>
             </w:tcBorders>
+            <w:tcMar/>
             <w:vAlign w:val="center"/>
             <w:hideMark/>
           </w:tcPr>
@@ -22205,7 +22374,7 @@
           <w:lang w:val="en-US"/>
         </w:rPr>
         <w:sectPr>
-          <w:pgSz w:w="15840" w:h="24480" w:code="3"/>
+          <w:pgSz w:w="15840" w:h="24480" w:orient="portrait" w:code="3"/>
           <w:pgMar w:top="1411" w:right="1699" w:bottom="1411" w:left="1699" w:header="706" w:footer="706" w:gutter="0"/>
           <w:cols w:space="708"/>
           <w:docGrid w:linePitch="360"/>
@@ -22227,7 +22396,7 @@
       </w:pPr>
     </w:p>
     <w:sectPr>
-      <w:pgSz w:w="12240" w:h="15840"/>
+      <w:pgSz w:w="12240" w:h="15840" w:orient="portrait"/>
       <w:pgMar w:top="1417" w:right="1701" w:bottom="1417" w:left="1701" w:header="708" w:footer="708" w:gutter="0"/>
       <w:cols w:space="708"/>
       <w:docGrid w:linePitch="360"/>
@@ -22238,7 +22407,7 @@
 
 <file path=word/comments.xml><?xml version="1.0" encoding="utf-8"?>
 <w:comments xmlns:wpc="http://schemas.microsoft.com/office/word/2010/wordprocessingCanvas" xmlns:cx="http://schemas.microsoft.com/office/drawing/2014/chartex" xmlns:cx1="http://schemas.microsoft.com/office/drawing/2015/9/8/chartex" xmlns:cx2="http://schemas.microsoft.com/office/drawing/2015/10/21/chartex" xmlns:cx3="http://schemas.microsoft.com/office/drawing/2016/5/9/chartex" xmlns:cx4="http://schemas.microsoft.com/office/drawing/2016/5/10/chartex" xmlns:cx5="http://schemas.microsoft.com/office/drawing/2016/5/11/chartex" xmlns:cx6="http://schemas.microsoft.com/office/drawing/2016/5/12/chartex" xmlns:cx7="http://schemas.microsoft.com/office/drawing/2016/5/13/chartex" xmlns:cx8="http://schemas.microsoft.com/office/drawing/2016/5/14/chartex" xmlns:mc="http://schemas.openxmlformats.org/markup-compatibility/2006" xmlns:aink="http://schemas.microsoft.com/office/drawing/2016/ink" xmlns:am3d="http://schemas.microsoft.com/office/drawing/2017/model3d" xmlns:o="urn:schemas-microsoft-com:office:office" xmlns:oel="http://schemas.microsoft.com/office/2019/extlst" xmlns:r="http://schemas.openxmlformats.org/officeDocument/2006/relationships" xmlns:m="http://schemas.openxmlformats.org/officeDocument/2006/math" xmlns:v="urn:schemas-microsoft-com:vml" xmlns:wp14="http://schemas.microsoft.com/office/word/2010/wordprocessingDrawing" xmlns:wp="http://schemas.openxmlformats.org/drawingml/2006/wordprocessingDrawing" xmlns:w10="urn:schemas-microsoft-com:office:word" xmlns:w="http://schemas.openxmlformats.org/wordprocessingml/2006/main" xmlns:w14="http://schemas.microsoft.com/office/word/2010/wordml" xmlns:w15="http://schemas.microsoft.com/office/word/2012/wordml" xmlns:w16cex="http://schemas.microsoft.com/office/word/2018/wordml/cex" xmlns:w16cid="http://schemas.microsoft.com/office/word/2016/wordml/cid" xmlns:w16="http://schemas.microsoft.com/office/word/2018/wordml" xmlns:w16du="http://schemas.microsoft.com/office/word/2023/wordml/word16du" xmlns:w16sdtdh="http://schemas.microsoft.com/office/word/2020/wordml/sdtdatahash" xmlns:w16sdtfl="http://schemas.microsoft.com/office/word/2024/wordml/sdtformatlock" xmlns:w16se="http://schemas.microsoft.com/office/word/2015/wordml/symex" xmlns:wpg="http://schemas.microsoft.com/office/word/2010/wordprocessingGroup" xmlns:wpi="http://schemas.microsoft.com/office/word/2010/wordprocessingInk" xmlns:wne="http://schemas.microsoft.com/office/word/2006/wordml" xmlns:wps="http://schemas.microsoft.com/office/word/2010/wordprocessingShape" mc:Ignorable="w14 w15 w16se w16cid w16 w16cex w16sdtdh w16sdtfl w16du wp14">
-  <w:comment w:id="6" w:author="Julio César Iturra Sanhueza" w:date="2026-05-07T09:50:00Z" w:initials="JI">
+  <w:comment w:initials="JI" w:author="Julio César Iturra Sanhueza" w:date="2026-05-07T09:50:00Z" w:id="6">
     <w:p>
       <w:pPr>
         <w:pStyle w:val="CommentText"/>
@@ -22554,7 +22723,7 @@
         <w:ind w:left="720" w:hanging="360"/>
       </w:pPr>
       <w:rPr>
-        <w:rFonts w:ascii="Symbol" w:eastAsiaTheme="minorHAnsi" w:hAnsi="Symbol" w:cstheme="minorBidi" w:hint="default"/>
+        <w:rFonts w:hint="default" w:ascii="Symbol" w:hAnsi="Symbol" w:eastAsiaTheme="minorHAnsi" w:cstheme="minorBidi"/>
       </w:rPr>
     </w:lvl>
     <w:lvl w:ilvl="1" w:tplc="340A0003" w:tentative="1">
@@ -22566,7 +22735,7 @@
         <w:ind w:left="1440" w:hanging="360"/>
       </w:pPr>
       <w:rPr>
-        <w:rFonts w:ascii="Courier New" w:hAnsi="Courier New" w:cs="Courier New" w:hint="default"/>
+        <w:rFonts w:hint="default" w:ascii="Courier New" w:hAnsi="Courier New" w:cs="Courier New"/>
       </w:rPr>
     </w:lvl>
     <w:lvl w:ilvl="2" w:tplc="340A0005" w:tentative="1">
@@ -22578,7 +22747,7 @@
         <w:ind w:left="2160" w:hanging="360"/>
       </w:pPr>
       <w:rPr>
-        <w:rFonts w:ascii="Wingdings" w:hAnsi="Wingdings" w:hint="default"/>
+        <w:rFonts w:hint="default" w:ascii="Wingdings" w:hAnsi="Wingdings"/>
       </w:rPr>
     </w:lvl>
     <w:lvl w:ilvl="3" w:tplc="340A0001" w:tentative="1">
@@ -22590,7 +22759,7 @@
         <w:ind w:left="2880" w:hanging="360"/>
       </w:pPr>
       <w:rPr>
-        <w:rFonts w:ascii="Symbol" w:hAnsi="Symbol" w:hint="default"/>
+        <w:rFonts w:hint="default" w:ascii="Symbol" w:hAnsi="Symbol"/>
       </w:rPr>
     </w:lvl>
     <w:lvl w:ilvl="4" w:tplc="340A0003" w:tentative="1">
@@ -22602,7 +22771,7 @@
         <w:ind w:left="3600" w:hanging="360"/>
       </w:pPr>
       <w:rPr>
-        <w:rFonts w:ascii="Courier New" w:hAnsi="Courier New" w:cs="Courier New" w:hint="default"/>
+        <w:rFonts w:hint="default" w:ascii="Courier New" w:hAnsi="Courier New" w:cs="Courier New"/>
       </w:rPr>
     </w:lvl>
     <w:lvl w:ilvl="5" w:tplc="340A0005" w:tentative="1">
@@ -22614,7 +22783,7 @@
         <w:ind w:left="4320" w:hanging="360"/>
       </w:pPr>
       <w:rPr>
-        <w:rFonts w:ascii="Wingdings" w:hAnsi="Wingdings" w:hint="default"/>
+        <w:rFonts w:hint="default" w:ascii="Wingdings" w:hAnsi="Wingdings"/>
       </w:rPr>
     </w:lvl>
     <w:lvl w:ilvl="6" w:tplc="340A0001" w:tentative="1">
@@ -22626,7 +22795,7 @@
         <w:ind w:left="5040" w:hanging="360"/>
       </w:pPr>
       <w:rPr>
-        <w:rFonts w:ascii="Symbol" w:hAnsi="Symbol" w:hint="default"/>
+        <w:rFonts w:hint="default" w:ascii="Symbol" w:hAnsi="Symbol"/>
       </w:rPr>
     </w:lvl>
     <w:lvl w:ilvl="7" w:tplc="340A0003" w:tentative="1">
@@ -22638,7 +22807,7 @@
         <w:ind w:left="5760" w:hanging="360"/>
       </w:pPr>
       <w:rPr>
-        <w:rFonts w:ascii="Courier New" w:hAnsi="Courier New" w:cs="Courier New" w:hint="default"/>
+        <w:rFonts w:hint="default" w:ascii="Courier New" w:hAnsi="Courier New" w:cs="Courier New"/>
       </w:rPr>
     </w:lvl>
     <w:lvl w:ilvl="8" w:tplc="340A0005" w:tentative="1">
@@ -22650,7 +22819,7 @@
         <w:ind w:left="6480" w:hanging="360"/>
       </w:pPr>
       <w:rPr>
-        <w:rFonts w:ascii="Wingdings" w:hAnsi="Wingdings" w:hint="default"/>
+        <w:rFonts w:hint="default" w:ascii="Wingdings" w:hAnsi="Wingdings"/>
       </w:rPr>
     </w:lvl>
   </w:abstractNum>
@@ -22666,7 +22835,7 @@
         <w:ind w:left="720" w:hanging="360"/>
       </w:pPr>
       <w:rPr>
-        <w:rFonts w:ascii="Times New Roman" w:eastAsia="Times New Roman" w:hAnsi="Times New Roman" w:cs="Times New Roman" w:hint="default"/>
+        <w:rFonts w:hint="default" w:ascii="Times New Roman" w:hAnsi="Times New Roman" w:eastAsia="Times New Roman" w:cs="Times New Roman"/>
       </w:rPr>
     </w:lvl>
     <w:lvl w:ilvl="1" w:tplc="04090003" w:tentative="1">
@@ -22678,7 +22847,7 @@
         <w:ind w:left="1440" w:hanging="360"/>
       </w:pPr>
       <w:rPr>
-        <w:rFonts w:ascii="Courier New" w:hAnsi="Courier New" w:cs="Courier New" w:hint="default"/>
+        <w:rFonts w:hint="default" w:ascii="Courier New" w:hAnsi="Courier New" w:cs="Courier New"/>
       </w:rPr>
     </w:lvl>
     <w:lvl w:ilvl="2" w:tplc="04090005" w:tentative="1">
@@ -22690,7 +22859,7 @@
         <w:ind w:left="2160" w:hanging="360"/>
       </w:pPr>
       <w:rPr>
-        <w:rFonts w:ascii="Wingdings" w:hAnsi="Wingdings" w:hint="default"/>
+        <w:rFonts w:hint="default" w:ascii="Wingdings" w:hAnsi="Wingdings"/>
       </w:rPr>
     </w:lvl>
     <w:lvl w:ilvl="3" w:tplc="04090001" w:tentative="1">
@@ -22702,7 +22871,7 @@
         <w:ind w:left="2880" w:hanging="360"/>
       </w:pPr>
       <w:rPr>
-        <w:rFonts w:ascii="Symbol" w:hAnsi="Symbol" w:hint="default"/>
+        <w:rFonts w:hint="default" w:ascii="Symbol" w:hAnsi="Symbol"/>
       </w:rPr>
     </w:lvl>
     <w:lvl w:ilvl="4" w:tplc="04090003" w:tentative="1">
@@ -22714,7 +22883,7 @@
         <w:ind w:left="3600" w:hanging="360"/>
       </w:pPr>
       <w:rPr>
-        <w:rFonts w:ascii="Courier New" w:hAnsi="Courier New" w:cs="Courier New" w:hint="default"/>
+        <w:rFonts w:hint="default" w:ascii="Courier New" w:hAnsi="Courier New" w:cs="Courier New"/>
       </w:rPr>
     </w:lvl>
     <w:lvl w:ilvl="5" w:tplc="04090005" w:tentative="1">
@@ -22726,7 +22895,7 @@
         <w:ind w:left="4320" w:hanging="360"/>
       </w:pPr>
       <w:rPr>
-        <w:rFonts w:ascii="Wingdings" w:hAnsi="Wingdings" w:hint="default"/>
+        <w:rFonts w:hint="default" w:ascii="Wingdings" w:hAnsi="Wingdings"/>
       </w:rPr>
     </w:lvl>
     <w:lvl w:ilvl="6" w:tplc="04090001" w:tentative="1">
@@ -22738,7 +22907,7 @@
         <w:ind w:left="5040" w:hanging="360"/>
       </w:pPr>
       <w:rPr>
-        <w:rFonts w:ascii="Symbol" w:hAnsi="Symbol" w:hint="default"/>
+        <w:rFonts w:hint="default" w:ascii="Symbol" w:hAnsi="Symbol"/>
       </w:rPr>
     </w:lvl>
     <w:lvl w:ilvl="7" w:tplc="04090003" w:tentative="1">
@@ -22750,7 +22919,7 @@
         <w:ind w:left="5760" w:hanging="360"/>
       </w:pPr>
       <w:rPr>
-        <w:rFonts w:ascii="Courier New" w:hAnsi="Courier New" w:cs="Courier New" w:hint="default"/>
+        <w:rFonts w:hint="default" w:ascii="Courier New" w:hAnsi="Courier New" w:cs="Courier New"/>
       </w:rPr>
     </w:lvl>
     <w:lvl w:ilvl="8" w:tplc="04090005" w:tentative="1">
@@ -22762,7 +22931,7 @@
         <w:ind w:left="6480" w:hanging="360"/>
       </w:pPr>
       <w:rPr>
-        <w:rFonts w:ascii="Wingdings" w:hAnsi="Wingdings" w:hint="default"/>
+        <w:rFonts w:hint="default" w:ascii="Wingdings" w:hAnsi="Wingdings"/>
       </w:rPr>
     </w:lvl>
   </w:abstractNum>
@@ -22891,7 +23060,7 @@
         <w:ind w:left="720" w:hanging="360"/>
       </w:pPr>
       <w:rPr>
-        <w:rFonts w:ascii="Times New Roman" w:eastAsia="Times New Roman" w:hAnsi="Times New Roman" w:cs="Times New Roman" w:hint="default"/>
+        <w:rFonts w:hint="default" w:ascii="Times New Roman" w:hAnsi="Times New Roman" w:eastAsia="Times New Roman" w:cs="Times New Roman"/>
       </w:rPr>
     </w:lvl>
     <w:lvl w:ilvl="1" w:tplc="04090003" w:tentative="1">
@@ -22903,7 +23072,7 @@
         <w:ind w:left="1440" w:hanging="360"/>
       </w:pPr>
       <w:rPr>
-        <w:rFonts w:ascii="Courier New" w:hAnsi="Courier New" w:cs="Courier New" w:hint="default"/>
+        <w:rFonts w:hint="default" w:ascii="Courier New" w:hAnsi="Courier New" w:cs="Courier New"/>
       </w:rPr>
     </w:lvl>
     <w:lvl w:ilvl="2" w:tplc="04090005" w:tentative="1">
@@ -22915,7 +23084,7 @@
         <w:ind w:left="2160" w:hanging="360"/>
       </w:pPr>
       <w:rPr>
-        <w:rFonts w:ascii="Wingdings" w:hAnsi="Wingdings" w:hint="default"/>
+        <w:rFonts w:hint="default" w:ascii="Wingdings" w:hAnsi="Wingdings"/>
       </w:rPr>
     </w:lvl>
     <w:lvl w:ilvl="3" w:tplc="04090001" w:tentative="1">
@@ -22927,7 +23096,7 @@
         <w:ind w:left="2880" w:hanging="360"/>
       </w:pPr>
       <w:rPr>
-        <w:rFonts w:ascii="Symbol" w:hAnsi="Symbol" w:hint="default"/>
+        <w:rFonts w:hint="default" w:ascii="Symbol" w:hAnsi="Symbol"/>
       </w:rPr>
     </w:lvl>
     <w:lvl w:ilvl="4" w:tplc="04090003" w:tentative="1">
@@ -22939,7 +23108,7 @@
         <w:ind w:left="3600" w:hanging="360"/>
       </w:pPr>
       <w:rPr>
-        <w:rFonts w:ascii="Courier New" w:hAnsi="Courier New" w:cs="Courier New" w:hint="default"/>
+        <w:rFonts w:hint="default" w:ascii="Courier New" w:hAnsi="Courier New" w:cs="Courier New"/>
       </w:rPr>
     </w:lvl>
     <w:lvl w:ilvl="5" w:tplc="04090005" w:tentative="1">
@@ -22951,7 +23120,7 @@
         <w:ind w:left="4320" w:hanging="360"/>
       </w:pPr>
       <w:rPr>
-        <w:rFonts w:ascii="Wingdings" w:hAnsi="Wingdings" w:hint="default"/>
+        <w:rFonts w:hint="default" w:ascii="Wingdings" w:hAnsi="Wingdings"/>
       </w:rPr>
     </w:lvl>
     <w:lvl w:ilvl="6" w:tplc="04090001" w:tentative="1">
@@ -22963,7 +23132,7 @@
         <w:ind w:left="5040" w:hanging="360"/>
       </w:pPr>
       <w:rPr>
-        <w:rFonts w:ascii="Symbol" w:hAnsi="Symbol" w:hint="default"/>
+        <w:rFonts w:hint="default" w:ascii="Symbol" w:hAnsi="Symbol"/>
       </w:rPr>
     </w:lvl>
     <w:lvl w:ilvl="7" w:tplc="04090003" w:tentative="1">
@@ -22975,7 +23144,7 @@
         <w:ind w:left="5760" w:hanging="360"/>
       </w:pPr>
       <w:rPr>
-        <w:rFonts w:ascii="Courier New" w:hAnsi="Courier New" w:cs="Courier New" w:hint="default"/>
+        <w:rFonts w:hint="default" w:ascii="Courier New" w:hAnsi="Courier New" w:cs="Courier New"/>
       </w:rPr>
     </w:lvl>
     <w:lvl w:ilvl="8" w:tplc="04090005" w:tentative="1">
@@ -22987,7 +23156,7 @@
         <w:ind w:left="6480" w:hanging="360"/>
       </w:pPr>
       <w:rPr>
-        <w:rFonts w:ascii="Wingdings" w:hAnsi="Wingdings" w:hint="default"/>
+        <w:rFonts w:hint="default" w:ascii="Wingdings" w:hAnsi="Wingdings"/>
       </w:rPr>
     </w:lvl>
   </w:abstractNum>
@@ -23018,11 +23187,11 @@
 </file>
 
 <file path=word/styles.xml><?xml version="1.0" encoding="utf-8"?>
-<w:styles xmlns:mc="http://schemas.openxmlformats.org/markup-compatibility/2006" xmlns:r="http://schemas.openxmlformats.org/officeDocument/2006/relationships" xmlns:w="http://schemas.openxmlformats.org/wordprocessingml/2006/main" xmlns:w14="http://schemas.microsoft.com/office/word/2010/wordml" xmlns:w15="http://schemas.microsoft.com/office/word/2012/wordml" xmlns:w16cex="http://schemas.microsoft.com/office/word/2018/wordml/cex" xmlns:w16cid="http://schemas.microsoft.com/office/word/2016/wordml/cid" xmlns:w16="http://schemas.microsoft.com/office/word/2018/wordml" xmlns:w16du="http://schemas.microsoft.com/office/word/2023/wordml/word16du" xmlns:w16sdtdh="http://schemas.microsoft.com/office/word/2020/wordml/sdtdatahash" xmlns:w16sdtfl="http://schemas.microsoft.com/office/word/2024/wordml/sdtformatlock" xmlns:w16se="http://schemas.microsoft.com/office/word/2015/wordml/symex" mc:Ignorable="w14 w15 w16se w16cid w16 w16cex w16sdtdh w16sdtfl w16du">
+<w:styles xmlns:wp14="http://schemas.microsoft.com/office/word/2010/wordprocessingDrawing" xmlns:mc="http://schemas.openxmlformats.org/markup-compatibility/2006" xmlns:r="http://schemas.openxmlformats.org/officeDocument/2006/relationships" xmlns:w="http://schemas.openxmlformats.org/wordprocessingml/2006/main" xmlns:w14="http://schemas.microsoft.com/office/word/2010/wordml" xmlns:w15="http://schemas.microsoft.com/office/word/2012/wordml" xmlns:w16cex="http://schemas.microsoft.com/office/word/2018/wordml/cex" xmlns:w16cid="http://schemas.microsoft.com/office/word/2016/wordml/cid" xmlns:w16="http://schemas.microsoft.com/office/word/2018/wordml" xmlns:w16du="http://schemas.microsoft.com/office/word/2023/wordml/word16du" xmlns:w16sdtdh="http://schemas.microsoft.com/office/word/2020/wordml/sdtdatahash" xmlns:w16sdtfl="http://schemas.microsoft.com/office/word/2024/wordml/sdtformatlock" xmlns:w16se="http://schemas.microsoft.com/office/word/2015/wordml/symex" mc:Ignorable="w14 w15 w16se w16cid w16 w16cex w16sdtdh w16sdtfl w16du wp14">
   <w:docDefaults>
     <w:rPrDefault>
       <w:rPr>
-        <w:rFonts w:asciiTheme="minorHAnsi" w:eastAsiaTheme="minorHAnsi" w:hAnsiTheme="minorHAnsi" w:cstheme="minorBidi"/>
+        <w:rFonts w:asciiTheme="minorHAnsi" w:hAnsiTheme="minorHAnsi" w:eastAsiaTheme="minorHAnsi" w:cstheme="minorBidi"/>
         <w:kern w:val="2"/>
         <w:sz w:val="24"/>
         <w:szCs w:val="24"/>
@@ -23039,14 +23208,14 @@
   <w:latentStyles w:defLockedState="0" w:defUIPriority="99" w:defSemiHidden="0" w:defUnhideWhenUsed="0" w:defQFormat="0" w:count="376">
     <w:lsdException w:name="Normal" w:uiPriority="0" w:qFormat="1"/>
     <w:lsdException w:name="heading 1" w:uiPriority="9" w:qFormat="1"/>
-    <w:lsdException w:name="heading 2" w:semiHidden="1" w:uiPriority="9" w:unhideWhenUsed="1" w:qFormat="1"/>
-    <w:lsdException w:name="heading 3" w:semiHidden="1" w:uiPriority="9" w:unhideWhenUsed="1" w:qFormat="1"/>
-    <w:lsdException w:name="heading 4" w:semiHidden="1" w:uiPriority="9" w:unhideWhenUsed="1" w:qFormat="1"/>
-    <w:lsdException w:name="heading 5" w:semiHidden="1" w:uiPriority="9" w:unhideWhenUsed="1" w:qFormat="1"/>
-    <w:lsdException w:name="heading 6" w:semiHidden="1" w:uiPriority="9" w:unhideWhenUsed="1" w:qFormat="1"/>
-    <w:lsdException w:name="heading 7" w:semiHidden="1" w:uiPriority="9" w:unhideWhenUsed="1" w:qFormat="1"/>
-    <w:lsdException w:name="heading 8" w:semiHidden="1" w:uiPriority="9" w:unhideWhenUsed="1" w:qFormat="1"/>
-    <w:lsdException w:name="heading 9" w:semiHidden="1" w:uiPriority="9" w:unhideWhenUsed="1" w:qFormat="1"/>
+    <w:lsdException w:name="heading 2" w:uiPriority="9" w:semiHidden="1" w:unhideWhenUsed="1" w:qFormat="1"/>
+    <w:lsdException w:name="heading 3" w:uiPriority="9" w:semiHidden="1" w:unhideWhenUsed="1" w:qFormat="1"/>
+    <w:lsdException w:name="heading 4" w:uiPriority="9" w:semiHidden="1" w:unhideWhenUsed="1" w:qFormat="1"/>
+    <w:lsdException w:name="heading 5" w:uiPriority="9" w:semiHidden="1" w:unhideWhenUsed="1" w:qFormat="1"/>
+    <w:lsdException w:name="heading 6" w:uiPriority="9" w:semiHidden="1" w:unhideWhenUsed="1" w:qFormat="1"/>
+    <w:lsdException w:name="heading 7" w:uiPriority="9" w:semiHidden="1" w:unhideWhenUsed="1" w:qFormat="1"/>
+    <w:lsdException w:name="heading 8" w:uiPriority="9" w:semiHidden="1" w:unhideWhenUsed="1" w:qFormat="1"/>
+    <w:lsdException w:name="heading 9" w:uiPriority="9" w:semiHidden="1" w:unhideWhenUsed="1" w:qFormat="1"/>
     <w:lsdException w:name="index 1" w:semiHidden="1" w:unhideWhenUsed="1"/>
     <w:lsdException w:name="index 2" w:semiHidden="1" w:unhideWhenUsed="1"/>
     <w:lsdException w:name="index 3" w:semiHidden="1" w:unhideWhenUsed="1"/>
@@ -23056,22 +23225,22 @@
     <w:lsdException w:name="index 7" w:semiHidden="1" w:unhideWhenUsed="1"/>
     <w:lsdException w:name="index 8" w:semiHidden="1" w:unhideWhenUsed="1"/>
     <w:lsdException w:name="index 9" w:semiHidden="1" w:unhideWhenUsed="1"/>
-    <w:lsdException w:name="toc 1" w:semiHidden="1" w:uiPriority="39" w:unhideWhenUsed="1"/>
-    <w:lsdException w:name="toc 2" w:semiHidden="1" w:uiPriority="39" w:unhideWhenUsed="1"/>
-    <w:lsdException w:name="toc 3" w:semiHidden="1" w:uiPriority="39" w:unhideWhenUsed="1"/>
-    <w:lsdException w:name="toc 4" w:semiHidden="1" w:uiPriority="39" w:unhideWhenUsed="1"/>
-    <w:lsdException w:name="toc 5" w:semiHidden="1" w:uiPriority="39" w:unhideWhenUsed="1"/>
-    <w:lsdException w:name="toc 6" w:semiHidden="1" w:uiPriority="39" w:unhideWhenUsed="1"/>
-    <w:lsdException w:name="toc 7" w:semiHidden="1" w:uiPriority="39" w:unhideWhenUsed="1"/>
-    <w:lsdException w:name="toc 8" w:semiHidden="1" w:uiPriority="39" w:unhideWhenUsed="1"/>
-    <w:lsdException w:name="toc 9" w:semiHidden="1" w:uiPriority="39" w:unhideWhenUsed="1"/>
+    <w:lsdException w:name="toc 1" w:uiPriority="39" w:semiHidden="1" w:unhideWhenUsed="1"/>
+    <w:lsdException w:name="toc 2" w:uiPriority="39" w:semiHidden="1" w:unhideWhenUsed="1"/>
+    <w:lsdException w:name="toc 3" w:uiPriority="39" w:semiHidden="1" w:unhideWhenUsed="1"/>
+    <w:lsdException w:name="toc 4" w:uiPriority="39" w:semiHidden="1" w:unhideWhenUsed="1"/>
+    <w:lsdException w:name="toc 5" w:uiPriority="39" w:semiHidden="1" w:unhideWhenUsed="1"/>
+    <w:lsdException w:name="toc 6" w:uiPriority="39" w:semiHidden="1" w:unhideWhenUsed="1"/>
+    <w:lsdException w:name="toc 7" w:uiPriority="39" w:semiHidden="1" w:unhideWhenUsed="1"/>
+    <w:lsdException w:name="toc 8" w:uiPriority="39" w:semiHidden="1" w:unhideWhenUsed="1"/>
+    <w:lsdException w:name="toc 9" w:uiPriority="39" w:semiHidden="1" w:unhideWhenUsed="1"/>
     <w:lsdException w:name="Normal Indent" w:semiHidden="1" w:unhideWhenUsed="1"/>
     <w:lsdException w:name="footnote text" w:semiHidden="1" w:unhideWhenUsed="1"/>
     <w:lsdException w:name="annotation text" w:semiHidden="1" w:unhideWhenUsed="1"/>
     <w:lsdException w:name="header" w:semiHidden="1" w:unhideWhenUsed="1"/>
     <w:lsdException w:name="footer" w:semiHidden="1" w:unhideWhenUsed="1"/>
     <w:lsdException w:name="index heading" w:semiHidden="1" w:unhideWhenUsed="1"/>
-    <w:lsdException w:name="caption" w:semiHidden="1" w:uiPriority="35" w:unhideWhenUsed="1" w:qFormat="1"/>
+    <w:lsdException w:name="caption" w:uiPriority="35" w:semiHidden="1" w:unhideWhenUsed="1" w:qFormat="1"/>
     <w:lsdException w:name="table of figures" w:semiHidden="1" w:unhideWhenUsed="1"/>
     <w:lsdException w:name="envelope address" w:semiHidden="1" w:unhideWhenUsed="1"/>
     <w:lsdException w:name="envelope return" w:semiHidden="1" w:unhideWhenUsed="1"/>
@@ -23102,7 +23271,7 @@
     <w:lsdException w:name="Title" w:uiPriority="10" w:qFormat="1"/>
     <w:lsdException w:name="Closing" w:semiHidden="1" w:unhideWhenUsed="1"/>
     <w:lsdException w:name="Signature" w:semiHidden="1" w:unhideWhenUsed="1"/>
-    <w:lsdException w:name="Default Paragraph Font" w:semiHidden="1" w:uiPriority="1" w:unhideWhenUsed="1"/>
+    <w:lsdException w:name="Default Paragraph Font" w:uiPriority="1" w:semiHidden="1" w:unhideWhenUsed="1"/>
     <w:lsdException w:name="Body Text" w:semiHidden="1" w:unhideWhenUsed="1"/>
     <w:lsdException w:name="Body Text Indent" w:semiHidden="1" w:unhideWhenUsed="1"/>
     <w:lsdException w:name="List Continue" w:semiHidden="1" w:unhideWhenUsed="1"/>
@@ -23302,8 +23471,8 @@
     <w:lsdException w:name="Subtle Reference" w:uiPriority="31" w:qFormat="1"/>
     <w:lsdException w:name="Intense Reference" w:uiPriority="32" w:qFormat="1"/>
     <w:lsdException w:name="Book Title" w:uiPriority="33" w:qFormat="1"/>
-    <w:lsdException w:name="Bibliography" w:semiHidden="1" w:uiPriority="37" w:unhideWhenUsed="1"/>
-    <w:lsdException w:name="TOC Heading" w:semiHidden="1" w:uiPriority="39" w:unhideWhenUsed="1" w:qFormat="1"/>
+    <w:lsdException w:name="Bibliography" w:uiPriority="37" w:semiHidden="1" w:unhideWhenUsed="1"/>
+    <w:lsdException w:name="TOC Heading" w:uiPriority="39" w:semiHidden="1" w:unhideWhenUsed="1" w:qFormat="1"/>
     <w:lsdException w:name="Plain Table 1" w:uiPriority="41"/>
     <w:lsdException w:name="Plain Table 2" w:uiPriority="42"/>
     <w:lsdException w:name="Plain Table 3" w:uiPriority="43"/>
@@ -23414,7 +23583,7 @@
     <w:lsdException w:name="Unresolved Mention" w:semiHidden="1" w:unhideWhenUsed="1"/>
     <w:lsdException w:name="Smart Link" w:semiHidden="1" w:unhideWhenUsed="1"/>
   </w:latentStyles>
-  <w:style w:type="paragraph" w:default="1" w:styleId="Normal">
+  <w:style w:type="paragraph" w:styleId="Normal" w:default="1">
     <w:name w:val="Normal"/>
     <w:qFormat/>
     <w:rsid w:val="00DA0712"/>
@@ -23442,7 +23611,7 @@
       <w:outlineLvl w:val="0"/>
     </w:pPr>
     <w:rPr>
-      <w:rFonts w:asciiTheme="majorHAnsi" w:eastAsiaTheme="majorEastAsia" w:hAnsiTheme="majorHAnsi" w:cstheme="majorBidi"/>
+      <w:rFonts w:asciiTheme="majorHAnsi" w:hAnsiTheme="majorHAnsi" w:eastAsiaTheme="majorEastAsia" w:cstheme="majorBidi"/>
       <w:color w:val="0F4761" w:themeColor="accent1" w:themeShade="BF"/>
       <w:sz w:val="40"/>
       <w:szCs w:val="40"/>
@@ -23464,7 +23633,7 @@
       <w:outlineLvl w:val="1"/>
     </w:pPr>
     <w:rPr>
-      <w:rFonts w:asciiTheme="majorHAnsi" w:eastAsiaTheme="majorEastAsia" w:hAnsiTheme="majorHAnsi" w:cstheme="majorBidi"/>
+      <w:rFonts w:asciiTheme="majorHAnsi" w:hAnsiTheme="majorHAnsi" w:eastAsiaTheme="majorEastAsia" w:cstheme="majorBidi"/>
       <w:color w:val="0F4761" w:themeColor="accent1" w:themeShade="BF"/>
       <w:sz w:val="32"/>
       <w:szCs w:val="32"/>
@@ -23623,13 +23792,13 @@
       <w:color w:val="272727" w:themeColor="text1" w:themeTint="D8"/>
     </w:rPr>
   </w:style>
-  <w:style w:type="character" w:default="1" w:styleId="DefaultParagraphFont">
+  <w:style w:type="character" w:styleId="DefaultParagraphFont" w:default="1">
     <w:name w:val="Default Paragraph Font"/>
     <w:uiPriority w:val="1"/>
     <w:semiHidden/>
     <w:unhideWhenUsed/>
   </w:style>
-  <w:style w:type="table" w:default="1" w:styleId="TableNormal">
+  <w:style w:type="table" w:styleId="TableNormal" w:default="1">
     <w:name w:val="Normal Table"/>
     <w:uiPriority w:val="99"/>
     <w:semiHidden/>
@@ -23644,39 +23813,39 @@
       </w:tblCellMar>
     </w:tblPr>
   </w:style>
-  <w:style w:type="numbering" w:default="1" w:styleId="NoList">
+  <w:style w:type="numbering" w:styleId="NoList" w:default="1">
     <w:name w:val="No List"/>
     <w:uiPriority w:val="99"/>
     <w:semiHidden/>
     <w:unhideWhenUsed/>
   </w:style>
-  <w:style w:type="character" w:customStyle="1" w:styleId="Heading1Char">
+  <w:style w:type="character" w:styleId="Heading1Char" w:customStyle="1">
     <w:name w:val="Heading 1 Char"/>
     <w:basedOn w:val="DefaultParagraphFont"/>
     <w:link w:val="Heading1"/>
     <w:uiPriority w:val="9"/>
     <w:rsid w:val="00234BC7"/>
     <w:rPr>
-      <w:rFonts w:asciiTheme="majorHAnsi" w:eastAsiaTheme="majorEastAsia" w:hAnsiTheme="majorHAnsi" w:cstheme="majorBidi"/>
+      <w:rFonts w:asciiTheme="majorHAnsi" w:hAnsiTheme="majorHAnsi" w:eastAsiaTheme="majorEastAsia" w:cstheme="majorBidi"/>
       <w:color w:val="0F4761" w:themeColor="accent1" w:themeShade="BF"/>
       <w:sz w:val="40"/>
       <w:szCs w:val="40"/>
     </w:rPr>
   </w:style>
-  <w:style w:type="character" w:customStyle="1" w:styleId="Heading2Char">
+  <w:style w:type="character" w:styleId="Heading2Char" w:customStyle="1">
     <w:name w:val="Heading 2 Char"/>
     <w:basedOn w:val="DefaultParagraphFont"/>
     <w:link w:val="Heading2"/>
     <w:uiPriority w:val="9"/>
     <w:rsid w:val="00234BC7"/>
     <w:rPr>
-      <w:rFonts w:asciiTheme="majorHAnsi" w:eastAsiaTheme="majorEastAsia" w:hAnsiTheme="majorHAnsi" w:cstheme="majorBidi"/>
+      <w:rFonts w:asciiTheme="majorHAnsi" w:hAnsiTheme="majorHAnsi" w:eastAsiaTheme="majorEastAsia" w:cstheme="majorBidi"/>
       <w:color w:val="0F4761" w:themeColor="accent1" w:themeShade="BF"/>
       <w:sz w:val="32"/>
       <w:szCs w:val="32"/>
     </w:rPr>
   </w:style>
-  <w:style w:type="character" w:customStyle="1" w:styleId="Heading3Char">
+  <w:style w:type="character" w:styleId="Heading3Char" w:customStyle="1">
     <w:name w:val="Heading 3 Char"/>
     <w:basedOn w:val="DefaultParagraphFont"/>
     <w:link w:val="Heading3"/>
@@ -23689,7 +23858,7 @@
       <w:szCs w:val="28"/>
     </w:rPr>
   </w:style>
-  <w:style w:type="character" w:customStyle="1" w:styleId="Heading4Char">
+  <w:style w:type="character" w:styleId="Heading4Char" w:customStyle="1">
     <w:name w:val="Heading 4 Char"/>
     <w:basedOn w:val="DefaultParagraphFont"/>
     <w:link w:val="Heading4"/>
@@ -23702,7 +23871,7 @@
       <w:color w:val="0F4761" w:themeColor="accent1" w:themeShade="BF"/>
     </w:rPr>
   </w:style>
-  <w:style w:type="character" w:customStyle="1" w:styleId="Heading5Char">
+  <w:style w:type="character" w:styleId="Heading5Char" w:customStyle="1">
     <w:name w:val="Heading 5 Char"/>
     <w:basedOn w:val="DefaultParagraphFont"/>
     <w:link w:val="Heading5"/>
@@ -23714,7 +23883,7 @@
       <w:color w:val="0F4761" w:themeColor="accent1" w:themeShade="BF"/>
     </w:rPr>
   </w:style>
-  <w:style w:type="character" w:customStyle="1" w:styleId="Heading6Char">
+  <w:style w:type="character" w:styleId="Heading6Char" w:customStyle="1">
     <w:name w:val="Heading 6 Char"/>
     <w:basedOn w:val="DefaultParagraphFont"/>
     <w:link w:val="Heading6"/>
@@ -23728,7 +23897,7 @@
       <w:color w:val="595959" w:themeColor="text1" w:themeTint="A6"/>
     </w:rPr>
   </w:style>
-  <w:style w:type="character" w:customStyle="1" w:styleId="Heading7Char">
+  <w:style w:type="character" w:styleId="Heading7Char" w:customStyle="1">
     <w:name w:val="Heading 7 Char"/>
     <w:basedOn w:val="DefaultParagraphFont"/>
     <w:link w:val="Heading7"/>
@@ -23740,7 +23909,7 @@
       <w:color w:val="595959" w:themeColor="text1" w:themeTint="A6"/>
     </w:rPr>
   </w:style>
-  <w:style w:type="character" w:customStyle="1" w:styleId="Heading8Char">
+  <w:style w:type="character" w:styleId="Heading8Char" w:customStyle="1">
     <w:name w:val="Heading 8 Char"/>
     <w:basedOn w:val="DefaultParagraphFont"/>
     <w:link w:val="Heading8"/>
@@ -23754,7 +23923,7 @@
       <w:color w:val="272727" w:themeColor="text1" w:themeTint="D8"/>
     </w:rPr>
   </w:style>
-  <w:style w:type="character" w:customStyle="1" w:styleId="Heading9Char">
+  <w:style w:type="character" w:styleId="Heading9Char" w:customStyle="1">
     <w:name w:val="Heading 9 Char"/>
     <w:basedOn w:val="DefaultParagraphFont"/>
     <w:link w:val="Heading9"/>
@@ -23779,21 +23948,21 @@
       <w:contextualSpacing/>
     </w:pPr>
     <w:rPr>
-      <w:rFonts w:asciiTheme="majorHAnsi" w:eastAsiaTheme="majorEastAsia" w:hAnsiTheme="majorHAnsi" w:cstheme="majorBidi"/>
+      <w:rFonts w:asciiTheme="majorHAnsi" w:hAnsiTheme="majorHAnsi" w:eastAsiaTheme="majorEastAsia" w:cstheme="majorBidi"/>
       <w:spacing w:val="-10"/>
       <w:kern w:val="28"/>
       <w:sz w:val="56"/>
       <w:szCs w:val="56"/>
     </w:rPr>
   </w:style>
-  <w:style w:type="character" w:customStyle="1" w:styleId="TitleChar">
+  <w:style w:type="character" w:styleId="TitleChar" w:customStyle="1">
     <w:name w:val="Title Char"/>
     <w:basedOn w:val="DefaultParagraphFont"/>
     <w:link w:val="Title"/>
     <w:uiPriority w:val="10"/>
     <w:rsid w:val="00234BC7"/>
     <w:rPr>
-      <w:rFonts w:asciiTheme="majorHAnsi" w:eastAsiaTheme="majorEastAsia" w:hAnsiTheme="majorHAnsi" w:cstheme="majorBidi"/>
+      <w:rFonts w:asciiTheme="majorHAnsi" w:hAnsiTheme="majorHAnsi" w:eastAsiaTheme="majorEastAsia" w:cstheme="majorBidi"/>
       <w:spacing w:val="-10"/>
       <w:kern w:val="28"/>
       <w:sz w:val="56"/>
@@ -23821,7 +23990,7 @@
       <w:szCs w:val="28"/>
     </w:rPr>
   </w:style>
-  <w:style w:type="character" w:customStyle="1" w:styleId="SubtitleChar">
+  <w:style w:type="character" w:styleId="SubtitleChar" w:customStyle="1">
     <w:name w:val="Subtitle Char"/>
     <w:basedOn w:val="DefaultParagraphFont"/>
     <w:link w:val="Subtitle"/>
@@ -23853,7 +24022,7 @@
       <w:color w:val="404040" w:themeColor="text1" w:themeTint="BF"/>
     </w:rPr>
   </w:style>
-  <w:style w:type="character" w:customStyle="1" w:styleId="QuoteChar">
+  <w:style w:type="character" w:styleId="QuoteChar" w:customStyle="1">
     <w:name w:val="Quote Char"/>
     <w:basedOn w:val="DefaultParagraphFont"/>
     <w:link w:val="Quote"/>
@@ -23898,8 +24067,8 @@
     <w:rsid w:val="00234BC7"/>
     <w:pPr>
       <w:pBdr>
-        <w:top w:val="single" w:sz="4" w:space="10" w:color="0F4761" w:themeColor="accent1" w:themeShade="BF"/>
-        <w:bottom w:val="single" w:sz="4" w:space="10" w:color="0F4761" w:themeColor="accent1" w:themeShade="BF"/>
+        <w:top w:val="single" w:color="0F4761" w:themeColor="accent1" w:themeShade="BF" w:sz="4" w:space="10"/>
+        <w:bottom w:val="single" w:color="0F4761" w:themeColor="accent1" w:themeShade="BF" w:sz="4" w:space="10"/>
       </w:pBdr>
       <w:spacing w:before="360" w:after="360"/>
       <w:ind w:left="864" w:right="864"/>
@@ -23911,7 +24080,7 @@
       <w:color w:val="0F4761" w:themeColor="accent1" w:themeShade="BF"/>
     </w:rPr>
   </w:style>
-  <w:style w:type="character" w:customStyle="1" w:styleId="IntenseQuoteChar">
+  <w:style w:type="character" w:styleId="IntenseQuoteChar" w:customStyle="1">
     <w:name w:val="Intense Quote Char"/>
     <w:basedOn w:val="DefaultParagraphFont"/>
     <w:link w:val="IntenseQuote"/>
@@ -23965,7 +24134,7 @@
     </w:rPr>
   </w:style>
   <w:style w:type="character" w:styleId="CommentReference">
-    <w:name w:val="annotation reference"/>
+    <w:name w:val="Comment Reference"/>
     <w:basedOn w:val="DefaultParagraphFont"/>
     <w:uiPriority w:val="99"/>
     <w:semiHidden/>
@@ -23977,7 +24146,7 @@
     </w:rPr>
   </w:style>
   <w:style w:type="paragraph" w:styleId="CommentText">
-    <w:name w:val="annotation text"/>
+    <w:name w:val="Comment Text"/>
     <w:basedOn w:val="Normal"/>
     <w:link w:val="CommentTextChar"/>
     <w:uiPriority w:val="99"/>
@@ -23988,7 +24157,7 @@
       <w:szCs w:val="20"/>
     </w:rPr>
   </w:style>
-  <w:style w:type="character" w:customStyle="1" w:styleId="CommentTextChar">
+  <w:style w:type="character" w:styleId="CommentTextChar" w:customStyle="1">
     <w:name w:val="Comment Text Char"/>
     <w:basedOn w:val="DefaultParagraphFont"/>
     <w:link w:val="CommentText"/>
@@ -24062,7 +24231,7 @@
       <w:ind w:left="480"/>
     </w:pPr>
   </w:style>
-  <w:style w:type="paragraph" w:customStyle="1" w:styleId="font-claude-response-body">
+  <w:style w:type="paragraph" w:styleId="font-claude-response-body" w:customStyle="1">
     <w:name w:val="font-claude-response-body"/>
     <w:basedOn w:val="Normal"/>
     <w:rsid w:val="002D1318"/>
@@ -24102,7 +24271,7 @@
       <w:spacing w:after="0"/>
     </w:pPr>
   </w:style>
-  <w:style w:type="character" w:customStyle="1" w:styleId="FooterChar">
+  <w:style w:type="character" w:styleId="FooterChar" w:customStyle="1">
     <w:name w:val="Footer Char"/>
     <w:basedOn w:val="DefaultParagraphFont"/>
     <w:link w:val="Footer"/>
@@ -24133,7 +24302,7 @@
       <w:spacing w:after="0" w:line="240" w:lineRule="auto"/>
     </w:pPr>
     <w:rPr>
-      <w:rFonts w:ascii="Times New Roman" w:eastAsia="Times New Roman" w:hAnsi="Times New Roman" w:cs="Times New Roman"/>
+      <w:rFonts w:ascii="Times New Roman" w:hAnsi="Times New Roman" w:eastAsia="Times New Roman" w:cs="Times New Roman"/>
       <w:kern w:val="0"/>
       <w:sz w:val="20"/>
       <w:szCs w:val="20"/>
@@ -24141,7 +24310,7 @@
       <w14:ligatures w14:val="none"/>
     </w:rPr>
   </w:style>
-  <w:style w:type="character" w:customStyle="1" w:styleId="FootnoteTextChar">
+  <w:style w:type="character" w:styleId="FootnoteTextChar" w:customStyle="1">
     <w:name w:val="Footnote Text Char"/>
     <w:basedOn w:val="DefaultParagraphFont"/>
     <w:link w:val="FootnoteText"/>
@@ -24149,7 +24318,7 @@
     <w:semiHidden/>
     <w:rsid w:val="002D1318"/>
     <w:rPr>
-      <w:rFonts w:ascii="Times New Roman" w:eastAsia="Times New Roman" w:hAnsi="Times New Roman" w:cs="Times New Roman"/>
+      <w:rFonts w:ascii="Times New Roman" w:hAnsi="Times New Roman" w:eastAsia="Times New Roman" w:cs="Times New Roman"/>
       <w:kern w:val="0"/>
       <w:sz w:val="20"/>
       <w:szCs w:val="20"/>
@@ -24169,17 +24338,17 @@
       <w:ind w:left="720" w:hanging="720"/>
     </w:pPr>
   </w:style>
-  <w:style w:type="character" w:customStyle="1" w:styleId="highlight">
+  <w:style w:type="character" w:styleId="highlight" w:customStyle="1">
     <w:name w:val="highlight"/>
     <w:basedOn w:val="DefaultParagraphFont"/>
     <w:rsid w:val="00A93664"/>
   </w:style>
-  <w:style w:type="character" w:customStyle="1" w:styleId="citation">
+  <w:style w:type="character" w:styleId="citation" w:customStyle="1">
     <w:name w:val="citation"/>
     <w:basedOn w:val="DefaultParagraphFont"/>
     <w:rsid w:val="00A93664"/>
   </w:style>
-  <w:style w:type="character" w:customStyle="1" w:styleId="citation-item">
+  <w:style w:type="character" w:styleId="citation-item" w:customStyle="1">
     <w:name w:val="citation-item"/>
     <w:basedOn w:val="DefaultParagraphFont"/>
     <w:rsid w:val="00A93664"/>
@@ -24209,7 +24378,7 @@
     </w:rPr>
   </w:style>
   <w:style w:type="paragraph" w:styleId="CommentSubject">
-    <w:name w:val="annotation subject"/>
+    <w:name w:val="Comment Subject"/>
     <w:basedOn w:val="CommentText"/>
     <w:next w:val="CommentText"/>
     <w:link w:val="CommentSubjectChar"/>
@@ -24222,7 +24391,7 @@
       <w:bCs/>
     </w:rPr>
   </w:style>
-  <w:style w:type="character" w:customStyle="1" w:styleId="CommentSubjectChar">
+  <w:style w:type="character" w:styleId="CommentSubjectChar" w:customStyle="1">
     <w:name w:val="Comment Subject Char"/>
     <w:basedOn w:val="CommentTextChar"/>
     <w:link w:val="CommentSubject"/>
@@ -24247,12 +24416,12 @@
     </w:pPr>
     <w:tblPr>
       <w:tblBorders>
-        <w:top w:val="single" w:sz="4" w:space="0" w:color="auto"/>
-        <w:left w:val="single" w:sz="4" w:space="0" w:color="auto"/>
-        <w:bottom w:val="single" w:sz="4" w:space="0" w:color="auto"/>
-        <w:right w:val="single" w:sz="4" w:space="0" w:color="auto"/>
-        <w:insideH w:val="single" w:sz="4" w:space="0" w:color="auto"/>
-        <w:insideV w:val="single" w:sz="4" w:space="0" w:color="auto"/>
+        <w:top w:val="single" w:color="auto" w:sz="4" w:space="0"/>
+        <w:left w:val="single" w:color="auto" w:sz="4" w:space="0"/>
+        <w:bottom w:val="single" w:color="auto" w:sz="4" w:space="0"/>
+        <w:right w:val="single" w:color="auto" w:sz="4" w:space="0"/>
+        <w:insideH w:val="single" w:color="auto" w:sz="4" w:space="0"/>
+        <w:insideV w:val="single" w:color="auto" w:sz="4" w:space="0"/>
       </w:tblBorders>
     </w:tblPr>
   </w:style>
@@ -24282,7 +24451,7 @@
       <w:spacing w:after="0"/>
     </w:pPr>
   </w:style>
-  <w:style w:type="character" w:customStyle="1" w:styleId="HeaderChar">
+  <w:style w:type="character" w:styleId="HeaderChar" w:customStyle="1">
     <w:name w:val="Header Char"/>
     <w:basedOn w:val="DefaultParagraphFont"/>
     <w:link w:val="Header"/>
@@ -24296,7 +24465,7 @@
 </file>
 
 <file path=word/theme/theme1.xml><?xml version="1.0" encoding="utf-8"?>
-<a:theme xmlns:a="http://schemas.openxmlformats.org/drawingml/2006/main" name="Office Theme">
+<a:theme xmlns:a="http://schemas.openxmlformats.org/drawingml/2006/main" xmlns:thm15="http://schemas.microsoft.com/office/thememl/2012/main" name="Office Theme">
   <a:themeElements>
     <a:clrScheme name="Office">
       <a:dk1>

</xml_diff>